<commit_message>
W3 Template Curation: reconcile Section 3 origins to 21 curated reference templates (DataBank-first), rebuild docx
</commit_message>
<xml_diff>
--- a/worlds/marva-lydell/submission/Alexander_World_Marva_latest_6_20.docx
+++ b/worlds/marva-lydell/submission/Alexander_World_Marva_latest_6_20.docx
@@ -8125,7 +8125,7 @@
           <w:color w:val="262B33"/>
           <w:sz w:val="16"/>
         </w:rPr>
-        <w:t>Files are designed after the tasks; each essential file exists because a task needs it for a correct answer. World-level files provide raw material, never an answer-key synthesis: there is no shared discharge summary, no final disposition statement, no settled cardiorenal plan, and no transition conclusion at world level. The severity-forward and administrative external surfaces (the two payer denials, the continued-stay worksheet, the DME and intake worksheets, the safety-event intake, the abstraction worksheet, the CDI query) are task-level so they cannot pre-answer their tasks. The two completion drafts (the transition note and the referral letter) are same-author task-level files with true placeholders on the scored sections. ID convention: EW for essential world-level, E#-T# for essential task-level keyed to the task, WS for supplementary world-level. Filenames are lowercase with underscores and an MMDDYYYY stamp matching the milestones. The file table uses seven columns: number, ID, filename.type, date or hospital-day anchor, Reference File Origin, description, and pearls, traps, and friction. Origins are marked at the likely level for Template Curation: clinical notes map to DataBank templates, flowsheets and forms with no DataBank match are custom-made templates, two notices are public-domain forms, and a single rhythm strip is the one writer-produced media file (rendered, license-clean, engineering does not convert it). Each row carries its document date so the reviewer can verify temporal anchoring at a glance.</w:t>
+        <w:t>Files are designed after the tasks; each essential file exists because a task needs it for a correct answer. World-level files provide raw material, never an answer-key synthesis: there is no shared discharge summary, no final disposition statement, no settled cardiorenal plan, and no transition conclusion at world level. The severity-forward and administrative external surfaces (the two payer denials, the continued-stay worksheet, the DME and intake worksheets, the safety-event intake, the abstraction worksheet, the CDI query) are task-level so they cannot pre-answer their tasks. The two completion drafts (the transition note and the referral letter) are same-author task-level files with true placeholders on the scored sections. ID convention: EW for essential world-level, E#-T# for essential task-level keyed to the task, WS for supplementary world-level. Filenames are lowercase with underscores and an MMDDYYYY stamp matching the milestones. The file table uses seven columns: number, ID, filename.type, date or hospital-day anchor, Reference File Origin, description, and pearls, traps, and friction. Origins are curated against the DataBank (Template Curation, 2026-06-20): sixteen DataBank-template files cover the clinical notes, consults, flowsheets, reports, and forms; five custom templates cover the lab and MAR flowsheet, the order set, the pharmacy note, the shift note, and the telemetry summary; one notice is a public-domain form; and a single rhythm strip is the one writer-produced media file (rendered, license-clean, engineering does not convert it). Each row carries its document date so the reviewer can verify temporal anchoring at a glance.</w:t>
       </w:r>
     </w:p>
     <w:p>
@@ -8541,7 +8541,7 @@
                 <w:color w:val="262B33"/>
                 <w:sz w:val="16"/>
               </w:rPr>
-              <w:t>Databank Template: DB_Progress_Note_Inpatient.docx</w:t>
+              <w:t>Databank Template: DB_Progress_Note.docx</w:t>
             </w:r>
           </w:p>
         </w:tc>
@@ -8641,7 +8641,7 @@
                 <w:color w:val="262B33"/>
                 <w:sz w:val="16"/>
               </w:rPr>
-              <w:t>Databank Template: DB_Progress_Note_Inpatient.docx</w:t>
+              <w:t>Databank Template: DB_Progress_Note.docx</w:t>
             </w:r>
           </w:p>
         </w:tc>
@@ -8741,7 +8741,7 @@
                 <w:color w:val="262B33"/>
                 <w:sz w:val="16"/>
               </w:rPr>
-              <w:t>Databank Template: DB_Progress_Note_Inpatient.docx</w:t>
+              <w:t>Databank Template: DB_Progress_Note.docx</w:t>
             </w:r>
           </w:p>
         </w:tc>
@@ -8841,7 +8841,7 @@
                 <w:color w:val="262B33"/>
                 <w:sz w:val="16"/>
               </w:rPr>
-              <w:t>Databank Template: DB_Progress_Note_Inpatient.docx</w:t>
+              <w:t>Databank Template: DB_Progress_Note.docx</w:t>
             </w:r>
           </w:p>
         </w:tc>
@@ -8941,7 +8941,7 @@
                 <w:color w:val="262B33"/>
                 <w:sz w:val="16"/>
               </w:rPr>
-              <w:t>Databank Template: DB_Specialty_Consult.docx</w:t>
+              <w:t>Databank Template: DB_Consult_Note_Subspecialty.docx</w:t>
             </w:r>
           </w:p>
         </w:tc>
@@ -9041,7 +9041,7 @@
                 <w:color w:val="262B33"/>
                 <w:sz w:val="16"/>
               </w:rPr>
-              <w:t>Databank Template: DB_Specialty_Consult.docx</w:t>
+              <w:t>Databank Template: DB_Consult_Note_Subspecialty.docx</w:t>
             </w:r>
           </w:p>
         </w:tc>
@@ -9141,7 +9141,7 @@
                 <w:color w:val="262B33"/>
                 <w:sz w:val="16"/>
               </w:rPr>
-              <w:t>Databank Template: DB_Specialty_Consult.docx</w:t>
+              <w:t>Databank Template: DB_Consult_Note_Subspecialty.docx</w:t>
             </w:r>
           </w:p>
         </w:tc>
@@ -9241,7 +9241,7 @@
                 <w:color w:val="262B33"/>
                 <w:sz w:val="16"/>
               </w:rPr>
-              <w:t>Custom Made: Custom_Respiratory_Therapy_Oxygen_Titration_Template.docx</w:t>
+              <w:t>Databank Template: DB_Respiratory_Therapy_Note.docx</w:t>
             </w:r>
           </w:p>
         </w:tc>
@@ -9341,7 +9341,7 @@
                 <w:color w:val="262B33"/>
                 <w:sz w:val="16"/>
               </w:rPr>
-              <w:t>Databank Template: DB_PT_Evaluation.docx</w:t>
+              <w:t>Databank Template: DB_PT_OT_Speech_Therapy_Evaluation.docx</w:t>
             </w:r>
           </w:p>
         </w:tc>
@@ -9441,7 +9441,7 @@
                 <w:color w:val="262B33"/>
                 <w:sz w:val="16"/>
               </w:rPr>
-              <w:t>Databank Template: DB_OT_Evaluation.docx</w:t>
+              <w:t>Databank Template: DB_PT_OT_Speech_Therapy_Evaluation.docx</w:t>
             </w:r>
           </w:p>
         </w:tc>
@@ -9641,7 +9641,7 @@
                 <w:color w:val="262B33"/>
                 <w:sz w:val="16"/>
               </w:rPr>
-              <w:t>Custom Made: Custom_MAR_Flowsheet_Template.docx</w:t>
+              <w:t>Custom Made: Custom_Clinical_Flowsheet_Template.docx</w:t>
             </w:r>
           </w:p>
         </w:tc>
@@ -9741,7 +9741,7 @@
                 <w:color w:val="262B33"/>
                 <w:sz w:val="16"/>
               </w:rPr>
-              <w:t>Custom Made: Custom_Lab_Trend_Flowsheet_Template.docx</w:t>
+              <w:t>Custom Made: Custom_Clinical_Flowsheet_Template.docx</w:t>
             </w:r>
           </w:p>
         </w:tc>
@@ -9841,7 +9841,7 @@
                 <w:color w:val="262B33"/>
                 <w:sz w:val="16"/>
               </w:rPr>
-              <w:t>Custom Made: Custom_Lab_Trend_Flowsheet_Template.docx</w:t>
+              <w:t>Custom Made: Custom_Clinical_Flowsheet_Template.docx</w:t>
             </w:r>
           </w:p>
         </w:tc>
@@ -9941,7 +9941,7 @@
                 <w:color w:val="262B33"/>
                 <w:sz w:val="16"/>
               </w:rPr>
-              <w:t>Custom Made: Custom_Weights_IO_Flowsheet_Template.docx</w:t>
+              <w:t>Databank Template: DB_Nursing_Flowsheet_Summary.docx</w:t>
             </w:r>
           </w:p>
         </w:tc>
@@ -10041,7 +10041,7 @@
                 <w:color w:val="262B33"/>
                 <w:sz w:val="16"/>
               </w:rPr>
-              <w:t>Custom Made: Custom_Vital_Signs_Flowsheet_Template.docx</w:t>
+              <w:t>Databank Template: DB_Nursing_Flowsheet_Summary.docx</w:t>
             </w:r>
           </w:p>
         </w:tc>
@@ -10141,7 +10141,7 @@
                 <w:color w:val="262B33"/>
                 <w:sz w:val="16"/>
               </w:rPr>
-              <w:t>Databank Template: DB_Diagnostic_Report.docx</w:t>
+              <w:t>Databank Template: DB_Echocardiogram_Report.docx</w:t>
             </w:r>
           </w:p>
         </w:tc>
@@ -10341,7 +10341,7 @@
                 <w:color w:val="262B33"/>
                 <w:sz w:val="16"/>
               </w:rPr>
-              <w:t>Databank Template: DB_Diagnostic_Report.docx</w:t>
+              <w:t>Databank Template: DB_ECG_Interpretation.docx</w:t>
             </w:r>
           </w:p>
         </w:tc>
@@ -10741,7 +10741,7 @@
                 <w:color w:val="262B33"/>
                 <w:sz w:val="16"/>
               </w:rPr>
-              <w:t>Databank Template: DB_Pharmacy_Note.docx</w:t>
+              <w:t>Custom Made: Custom_Pharmacy_Note_Template.docx</w:t>
             </w:r>
           </w:p>
         </w:tc>
@@ -10841,7 +10841,7 @@
                 <w:color w:val="262B33"/>
                 <w:sz w:val="16"/>
               </w:rPr>
-              <w:t>Databank Template: DB_Specialty_Consult.docx</w:t>
+              <w:t>Databank Template: DB_Consult_Note_Subspecialty.docx</w:t>
             </w:r>
           </w:p>
         </w:tc>
@@ -10941,7 +10941,7 @@
                 <w:color w:val="262B33"/>
                 <w:sz w:val="16"/>
               </w:rPr>
-              <w:t>Custom Made: Custom_Nursing_Flowsheet_Template.docx</w:t>
+              <w:t>Databank Template: DB_Nursing_Flowsheet_Summary.docx</w:t>
             </w:r>
           </w:p>
         </w:tc>
@@ -11141,7 +11141,7 @@
                 <w:color w:val="262B33"/>
                 <w:sz w:val="16"/>
               </w:rPr>
-              <w:t>Databank Template: DB_Diagnostic_Report.docx</w:t>
+              <w:t>Databank Template: DB_Echocardiogram_Report.docx</w:t>
             </w:r>
           </w:p>
         </w:tc>
@@ -11241,7 +11241,7 @@
                 <w:color w:val="262B33"/>
                 <w:sz w:val="16"/>
               </w:rPr>
-              <w:t>Databank Template: DB_Progress_Note_Inpatient.docx</w:t>
+              <w:t>Databank Template: DB_Progress_Note.docx</w:t>
             </w:r>
           </w:p>
         </w:tc>
@@ -12935,7 +12935,7 @@
                 <w:color w:val="262B33"/>
                 <w:sz w:val="16"/>
               </w:rPr>
-              <w:t>Custom Made: Custom_Patient_Education_Handout_Template.docx</w:t>
+              <w:t>Databank Template: DB_Patient_Education_Documentation.docx</w:t>
             </w:r>
           </w:p>
         </w:tc>
@@ -13135,7 +13135,7 @@
                 <w:color w:val="262B33"/>
                 <w:sz w:val="16"/>
               </w:rPr>
-              <w:t>Databank Template: DB_Nursing_Note.docx</w:t>
+              <w:t>Custom Made: Custom_Nursing_Shift_Note_Template.docx</w:t>
             </w:r>
           </w:p>
         </w:tc>
@@ -13235,7 +13235,7 @@
                 <w:color w:val="262B33"/>
                 <w:sz w:val="16"/>
               </w:rPr>
-              <w:t>Public Domain: Hospital_General_Consent_Blank.pdf</w:t>
+              <w:t>Databank Template: DB_Informed_Consent.docx</w:t>
             </w:r>
           </w:p>
         </w:tc>
@@ -13276,7 +13276,7 @@
           <w:color w:val="262B33"/>
           <w:sz w:val="16"/>
         </w:rPr>
-        <w:t>Total file count: 32 essential world-level (EW1 to EW32) plus 11 essential task-level plus 4 supplementary world-level equals 47 unique files. World-level files total 36 (32 essential plus 4 supplementary), which meets the 30-file minimum. Modalities span clinical notes, specialty consults, radiology and diagnostic reports, laboratory and flowsheet data, medication records, external correspondence and worksheets, and one rhythm-strip image, which is at least four distinct types. Essential-to-supplementary mix is about 89 percent essential at world level. Origins: most clinical notes map to DataBank templates, flowsheets and worksheets are custom-made templates, two notices are public-domain forms, and one rhythm strip (EW22) is the single writer-produced media file.</w:t>
+        <w:t>Total file count: 32 essential world-level (EW1 to EW32) plus 11 essential task-level plus 4 supplementary world-level equals 47 unique files. World-level files total 36 (32 essential plus 4 supplementary), which meets the 30-file minimum. Modalities span clinical notes, specialty consults, radiology and diagnostic reports, laboratory and flowsheet data, medication records, external correspondence and worksheets, and one rhythm-strip image, which is at least four distinct types. Essential-to-supplementary mix is about 89 percent essential at world level. Origins: the 36 world-level rows resolve to 21 reference templates (16 DataBank extractions, 5 custom drafts), one public-domain notice (WS2, the Medicare message), and one writer-produced rhythm strip (EW22).</w:t>
       </w:r>
     </w:p>
     <w:p>

</xml_diff>

<commit_message>
W3 EW22: replace single-lead strip with a 12-lead afib ECG (rate-controlled, machine-fields-only); reconcile spec + docx
</commit_message>
<xml_diff>
--- a/worlds/marva-lydell/submission/Alexander_World_Marva_latest_6_20.docx
+++ b/worlds/marva-lydell/submission/Alexander_World_Marva_latest_6_20.docx
@@ -8125,7 +8125,7 @@
           <w:color w:val="262B33"/>
           <w:sz w:val="16"/>
         </w:rPr>
-        <w:t>Files are designed after the tasks; each essential file exists because a task needs it for a correct answer. World-level files provide raw material, never an answer-key synthesis: there is no shared discharge summary, no final disposition statement, no settled cardiorenal plan, and no transition conclusion at world level. The severity-forward and administrative external surfaces (the two payer denials, the continued-stay worksheet, the DME and intake worksheets, the safety-event intake, the abstraction worksheet, the CDI query) are task-level so they cannot pre-answer their tasks. The two completion drafts (the transition note and the referral letter) are same-author task-level files with true placeholders on the scored sections. ID convention: EW for essential world-level, E#-T# for essential task-level keyed to the task, WS for supplementary world-level. Filenames are lowercase with underscores and an MMDDYYYY stamp matching the milestones. The file table uses seven columns: number, ID, filename.type, date or hospital-day anchor, Reference File Origin, description, and pearls, traps, and friction. Origins are curated against the DataBank (Template Curation, 2026-06-20): sixteen DataBank-template files cover the clinical notes, consults, flowsheets, reports, and forms; five custom templates cover the lab and MAR flowsheet, the order set, the pharmacy note, the shift note, and the telemetry summary; one notice is a public-domain form; and a single rhythm strip is the one writer-produced media file (rendered, license-clean, engineering does not convert it). Each row carries its document date so the reviewer can verify temporal anchoring at a glance.</w:t>
+        <w:t>Files are designed after the tasks; each essential file exists because a task needs it for a correct answer. World-level files provide raw material, never an answer-key synthesis: there is no shared discharge summary, no final disposition statement, no settled cardiorenal plan, and no transition conclusion at world level. The severity-forward and administrative external surfaces (the two payer denials, the continued-stay worksheet, the DME and intake worksheets, the safety-event intake, the abstraction worksheet, the CDI query) are task-level so they cannot pre-answer their tasks. The two completion drafts (the transition note and the referral letter) are same-author task-level files with true placeholders on the scored sections. ID convention: EW for essential world-level, E#-T# for essential task-level keyed to the task, WS for supplementary world-level. Filenames are lowercase with underscores and an MMDDYYYY stamp matching the milestones. The file table uses seven columns: number, ID, filename.type, date or hospital-day anchor, Reference File Origin, description, and pearls, traps, and friction. Origins are curated against the DataBank (Template Curation, 2026-06-20): sixteen DataBank-template files cover the clinical notes, consults, flowsheets, reports, and forms; five custom templates cover the lab and MAR flowsheet, the order set, the pharmacy note, the shift note, and the telemetry summary; one notice is a public-domain form; and a single twelve-lead ECG tracing is the one writer-produced media file (rendered, license-clean, engineering does not convert it). Each row carries its document date so the reviewer can verify temporal anchoring at a glance.</w:t>
       </w:r>
     </w:p>
     <w:p>
@@ -10413,7 +10413,7 @@
                 <w:color w:val="262B33"/>
                 <w:sz w:val="13"/>
               </w:rPr>
-              <w:t>afib_rhythm_strip_06152025.jpg</w:t>
+              <w:t>ecg_12lead_06152025.jpg</w:t>
             </w:r>
           </w:p>
         </w:tc>
@@ -10441,7 +10441,7 @@
                 <w:color w:val="262B33"/>
                 <w:sz w:val="16"/>
               </w:rPr>
-              <w:t>Writer-produced: afib_rhythm_strip_06152025.jpg</w:t>
+              <w:t>Writer-produced: ecg_12lead_06152025.jpg</w:t>
             </w:r>
           </w:p>
         </w:tc>
@@ -10455,7 +10455,7 @@
                 <w:color w:val="262B33"/>
                 <w:sz w:val="16"/>
               </w:rPr>
-              <w:t>Telemetry rhythm strip, atrial fibrillation, irregularly irregular and rate-controlled, machine fields only with no printed interpretation</w:t>
+              <w:t>Repeat twelve-lead ECG, atrial fibrillation, rate-controlled, with a lead II rhythm strip; machine fields only with no printed interpretation</w:t>
             </w:r>
           </w:p>
         </w:tc>
@@ -13276,7 +13276,7 @@
           <w:color w:val="262B33"/>
           <w:sz w:val="16"/>
         </w:rPr>
-        <w:t>Total file count: 32 essential world-level (EW1 to EW32) plus 11 essential task-level plus 4 supplementary world-level equals 47 unique files. World-level files total 36 (32 essential plus 4 supplementary), which meets the 30-file minimum. Modalities span clinical notes, specialty consults, radiology and diagnostic reports, laboratory and flowsheet data, medication records, external correspondence and worksheets, and one rhythm-strip image, which is at least four distinct types. Essential-to-supplementary mix is about 89 percent essential at world level. Origins: the 36 world-level rows resolve to 21 reference templates (16 DataBank extractions, 5 custom drafts), one public-domain notice (WS2, the Medicare message), and one writer-produced rhythm strip (EW22).</w:t>
+        <w:t>Total file count: 32 essential world-level (EW1 to EW32) plus 11 essential task-level plus 4 supplementary world-level equals 47 unique files. World-level files total 36 (32 essential plus 4 supplementary), which meets the 30-file minimum. Modalities span clinical notes, specialty consults, radiology and diagnostic reports, laboratory and flowsheet data, medication records, external correspondence and worksheets, and one twelve-lead ECG image, which is at least four distinct types. Essential-to-supplementary mix is about 89 percent essential at world level. Origins: the 36 world-level rows resolve to 21 reference templates (16 DataBank extractions, 5 custom drafts), one public-domain notice (WS2, the Medicare message), and one writer-produced twelve-lead ECG tracing (EW22).</w:t>
       </w:r>
     </w:p>
     <w:p>

</xml_diff>

<commit_message>
W3 cleanup: scrub template metadata + dashes; align Reference File Origin to official-template format; verify file system vs 06/09 canonical
</commit_message>
<xml_diff>
--- a/worlds/marva-lydell/submission/Alexander_World_Marva_latest_6_20.docx
+++ b/worlds/marva-lydell/submission/Alexander_World_Marva_latest_6_20.docx
@@ -8341,7 +8341,7 @@
                 <w:color w:val="262B33"/>
                 <w:sz w:val="16"/>
               </w:rPr>
-              <w:t>Databank Template: DB_ED_Physician_Note.docx</w:t>
+              <w:t>Databank Template (DB_ED_Physician_Note.docx)</w:t>
             </w:r>
           </w:p>
         </w:tc>
@@ -8441,7 +8441,7 @@
                 <w:color w:val="262B33"/>
                 <w:sz w:val="16"/>
               </w:rPr>
-              <w:t>Databank Template: DB_Admission_HP.docx</w:t>
+              <w:t>Databank Template (DB_Admission_HP.docx)</w:t>
             </w:r>
           </w:p>
         </w:tc>
@@ -8541,7 +8541,7 @@
                 <w:color w:val="262B33"/>
                 <w:sz w:val="16"/>
               </w:rPr>
-              <w:t>Databank Template: DB_Progress_Note.docx</w:t>
+              <w:t>Databank Template (DB_Progress_Note.docx)</w:t>
             </w:r>
           </w:p>
         </w:tc>
@@ -8641,7 +8641,7 @@
                 <w:color w:val="262B33"/>
                 <w:sz w:val="16"/>
               </w:rPr>
-              <w:t>Databank Template: DB_Progress_Note.docx</w:t>
+              <w:t>Databank Template (DB_Progress_Note.docx)</w:t>
             </w:r>
           </w:p>
         </w:tc>
@@ -8741,7 +8741,7 @@
                 <w:color w:val="262B33"/>
                 <w:sz w:val="16"/>
               </w:rPr>
-              <w:t>Databank Template: DB_Progress_Note.docx</w:t>
+              <w:t>Databank Template (DB_Progress_Note.docx)</w:t>
             </w:r>
           </w:p>
         </w:tc>
@@ -8841,7 +8841,7 @@
                 <w:color w:val="262B33"/>
                 <w:sz w:val="16"/>
               </w:rPr>
-              <w:t>Databank Template: DB_Progress_Note.docx</w:t>
+              <w:t>Databank Template (DB_Progress_Note.docx)</w:t>
             </w:r>
           </w:p>
         </w:tc>
@@ -8941,7 +8941,7 @@
                 <w:color w:val="262B33"/>
                 <w:sz w:val="16"/>
               </w:rPr>
-              <w:t>Databank Template: DB_Consult_Note_Subspecialty.docx</w:t>
+              <w:t>Databank Template (DB_Consult_Note_Subspecialty.docx)</w:t>
             </w:r>
           </w:p>
         </w:tc>
@@ -9041,7 +9041,7 @@
                 <w:color w:val="262B33"/>
                 <w:sz w:val="16"/>
               </w:rPr>
-              <w:t>Databank Template: DB_Consult_Note_Subspecialty.docx</w:t>
+              <w:t>Databank Template (DB_Consult_Note_Subspecialty.docx)</w:t>
             </w:r>
           </w:p>
         </w:tc>
@@ -9141,7 +9141,7 @@
                 <w:color w:val="262B33"/>
                 <w:sz w:val="16"/>
               </w:rPr>
-              <w:t>Databank Template: DB_Consult_Note_Subspecialty.docx</w:t>
+              <w:t>Databank Template (DB_Consult_Note_Subspecialty.docx)</w:t>
             </w:r>
           </w:p>
         </w:tc>
@@ -9241,7 +9241,7 @@
                 <w:color w:val="262B33"/>
                 <w:sz w:val="16"/>
               </w:rPr>
-              <w:t>Databank Template: DB_Respiratory_Therapy_Note.docx</w:t>
+              <w:t>Databank Template (DB_Respiratory_Therapy_Note.docx)</w:t>
             </w:r>
           </w:p>
         </w:tc>
@@ -9341,7 +9341,7 @@
                 <w:color w:val="262B33"/>
                 <w:sz w:val="16"/>
               </w:rPr>
-              <w:t>Databank Template: DB_PT_OT_Speech_Therapy_Evaluation.docx</w:t>
+              <w:t>Databank Template (DB_PT_OT_Speech_Therapy_Evaluation.docx)</w:t>
             </w:r>
           </w:p>
         </w:tc>
@@ -9441,7 +9441,7 @@
                 <w:color w:val="262B33"/>
                 <w:sz w:val="16"/>
               </w:rPr>
-              <w:t>Databank Template: DB_PT_OT_Speech_Therapy_Evaluation.docx</w:t>
+              <w:t>Databank Template (DB_PT_OT_Speech_Therapy_Evaluation.docx)</w:t>
             </w:r>
           </w:p>
         </w:tc>
@@ -9541,7 +9541,7 @@
                 <w:color w:val="262B33"/>
                 <w:sz w:val="16"/>
               </w:rPr>
-              <w:t>Databank Template: DB_Case_Management_Note.docx</w:t>
+              <w:t>Databank Template (DB_Case_Management_Note.docx)</w:t>
             </w:r>
           </w:p>
         </w:tc>
@@ -9641,7 +9641,7 @@
                 <w:color w:val="262B33"/>
                 <w:sz w:val="16"/>
               </w:rPr>
-              <w:t>Custom Made: Custom_Clinical_Flowsheet_Template.docx</w:t>
+              <w:t>Custom Made (Custom_Clinical_Flowsheet_Template.docx)</w:t>
             </w:r>
           </w:p>
         </w:tc>
@@ -9741,7 +9741,7 @@
                 <w:color w:val="262B33"/>
                 <w:sz w:val="16"/>
               </w:rPr>
-              <w:t>Custom Made: Custom_Clinical_Flowsheet_Template.docx</w:t>
+              <w:t>Custom Made (Custom_Clinical_Flowsheet_Template.docx)</w:t>
             </w:r>
           </w:p>
         </w:tc>
@@ -9841,7 +9841,7 @@
                 <w:color w:val="262B33"/>
                 <w:sz w:val="16"/>
               </w:rPr>
-              <w:t>Custom Made: Custom_Clinical_Flowsheet_Template.docx</w:t>
+              <w:t>Custom Made (Custom_Clinical_Flowsheet_Template.docx)</w:t>
             </w:r>
           </w:p>
         </w:tc>
@@ -9941,7 +9941,7 @@
                 <w:color w:val="262B33"/>
                 <w:sz w:val="16"/>
               </w:rPr>
-              <w:t>Databank Template: DB_Nursing_Flowsheet_Summary.docx</w:t>
+              <w:t>Databank Template (DB_Nursing_Flowsheet_Summary.docx)</w:t>
             </w:r>
           </w:p>
         </w:tc>
@@ -10041,7 +10041,7 @@
                 <w:color w:val="262B33"/>
                 <w:sz w:val="16"/>
               </w:rPr>
-              <w:t>Databank Template: DB_Nursing_Flowsheet_Summary.docx</w:t>
+              <w:t>Databank Template (DB_Nursing_Flowsheet_Summary.docx)</w:t>
             </w:r>
           </w:p>
         </w:tc>
@@ -10141,7 +10141,7 @@
                 <w:color w:val="262B33"/>
                 <w:sz w:val="16"/>
               </w:rPr>
-              <w:t>Databank Template: DB_Echocardiogram_Report.docx</w:t>
+              <w:t>Databank Template (DB_Echocardiogram_Report.docx)</w:t>
             </w:r>
           </w:p>
         </w:tc>
@@ -10241,7 +10241,7 @@
                 <w:color w:val="262B33"/>
                 <w:sz w:val="16"/>
               </w:rPr>
-              <w:t>Databank Template: DB_Radiology_Report.docx</w:t>
+              <w:t>Databank Template (DB_Radiology_Report.docx)</w:t>
             </w:r>
           </w:p>
         </w:tc>
@@ -10341,7 +10341,7 @@
                 <w:color w:val="262B33"/>
                 <w:sz w:val="16"/>
               </w:rPr>
-              <w:t>Databank Template: DB_ECG_Interpretation.docx</w:t>
+              <w:t>Databank Template (DB_ECG_Interpretation.docx)</w:t>
             </w:r>
           </w:p>
         </w:tc>
@@ -10441,7 +10441,7 @@
                 <w:color w:val="262B33"/>
                 <w:sz w:val="16"/>
               </w:rPr>
-              <w:t>Writer-produced: ecg_12lead_06152025.jpg</w:t>
+              <w:t>Writer-produced (12-lead ECG tracing, ECG generator)</w:t>
             </w:r>
           </w:p>
         </w:tc>
@@ -10541,7 +10541,7 @@
                 <w:color w:val="262B33"/>
                 <w:sz w:val="16"/>
               </w:rPr>
-              <w:t>Databank Template: DB_EMR_Medication_List.docx</w:t>
+              <w:t>Databank Template (DB_EMR_Medication_List.docx)</w:t>
             </w:r>
           </w:p>
         </w:tc>
@@ -10641,7 +10641,7 @@
                 <w:color w:val="262B33"/>
                 <w:sz w:val="16"/>
               </w:rPr>
-              <w:t>Custom Made: Custom_Order_Set_Template.docx</w:t>
+              <w:t>Custom Made (Custom_Order_Set_Template.docx)</w:t>
             </w:r>
           </w:p>
         </w:tc>
@@ -10741,7 +10741,7 @@
                 <w:color w:val="262B33"/>
                 <w:sz w:val="16"/>
               </w:rPr>
-              <w:t>Custom Made: Custom_Pharmacy_Note_Template.docx</w:t>
+              <w:t>Custom Made (Custom_Pharmacy_Note_Template.docx)</w:t>
             </w:r>
           </w:p>
         </w:tc>
@@ -10841,7 +10841,7 @@
                 <w:color w:val="262B33"/>
                 <w:sz w:val="16"/>
               </w:rPr>
-              <w:t>Databank Template: DB_Consult_Note_Subspecialty.docx</w:t>
+              <w:t>Databank Template (DB_Consult_Note_Subspecialty.docx)</w:t>
             </w:r>
           </w:p>
         </w:tc>
@@ -10941,7 +10941,7 @@
                 <w:color w:val="262B33"/>
                 <w:sz w:val="16"/>
               </w:rPr>
-              <w:t>Databank Template: DB_Nursing_Flowsheet_Summary.docx</w:t>
+              <w:t>Databank Template (DB_Nursing_Flowsheet_Summary.docx)</w:t>
             </w:r>
           </w:p>
         </w:tc>
@@ -11041,7 +11041,7 @@
                 <w:color w:val="262B33"/>
                 <w:sz w:val="16"/>
               </w:rPr>
-              <w:t>Databank Template: DB_Office_Visit_Note.docx</w:t>
+              <w:t>Databank Template (DB_Office_Visit_Note.docx)</w:t>
             </w:r>
           </w:p>
         </w:tc>
@@ -11141,7 +11141,7 @@
                 <w:color w:val="262B33"/>
                 <w:sz w:val="16"/>
               </w:rPr>
-              <w:t>Databank Template: DB_Echocardiogram_Report.docx</w:t>
+              <w:t>Databank Template (DB_Echocardiogram_Report.docx)</w:t>
             </w:r>
           </w:p>
         </w:tc>
@@ -11241,7 +11241,7 @@
                 <w:color w:val="262B33"/>
                 <w:sz w:val="16"/>
               </w:rPr>
-              <w:t>Databank Template: DB_Progress_Note.docx</w:t>
+              <w:t>Databank Template (DB_Progress_Note.docx)</w:t>
             </w:r>
           </w:p>
         </w:tc>
@@ -11341,7 +11341,7 @@
                 <w:color w:val="262B33"/>
                 <w:sz w:val="16"/>
               </w:rPr>
-              <w:t>Databank Template: DB_Social_Work_Note.docx</w:t>
+              <w:t>Databank Template (DB_Social_Work_Note.docx)</w:t>
             </w:r>
           </w:p>
         </w:tc>
@@ -11441,7 +11441,7 @@
                 <w:color w:val="262B33"/>
                 <w:sz w:val="16"/>
               </w:rPr>
-              <w:t>Custom Made: Custom_Telemetry_Summary_Template.docx</w:t>
+              <w:t>Custom Made (Custom_Telemetry_Summary_Template.docx)</w:t>
             </w:r>
           </w:p>
         </w:tc>
@@ -11688,7 +11688,7 @@
                 <w:color w:val="262B33"/>
                 <w:sz w:val="16"/>
               </w:rPr>
-              <w:t>Custom Made: Custom_Payer_Denial_Letter_Template.docx</w:t>
+              <w:t>Custom Made (Custom_Payer_Denial_Letter_Template.docx)</w:t>
             </w:r>
           </w:p>
         </w:tc>
@@ -11788,7 +11788,7 @@
                 <w:color w:val="262B33"/>
                 <w:sz w:val="16"/>
               </w:rPr>
-              <w:t>Custom Made: Custom_Outside_Medication_List_Template.docx</w:t>
+              <w:t>Custom Made (Custom_Outside_Medication_List_Template.docx)</w:t>
             </w:r>
           </w:p>
         </w:tc>
@@ -11888,7 +11888,7 @@
                 <w:color w:val="262B33"/>
                 <w:sz w:val="16"/>
               </w:rPr>
-              <w:t>Custom Made: Custom_Utilization_Review_Worksheet_Template.docx</w:t>
+              <w:t>Custom Made (Custom_Utilization_Review_Worksheet_Template.docx)</w:t>
             </w:r>
           </w:p>
         </w:tc>
@@ -11988,7 +11988,7 @@
                 <w:color w:val="262B33"/>
                 <w:sz w:val="16"/>
               </w:rPr>
-              <w:t>Custom Made: Custom_Transition_Note_Template.docx</w:t>
+              <w:t>Custom Made (Custom_Transition_Note_Template.docx)</w:t>
             </w:r>
           </w:p>
         </w:tc>
@@ -12088,7 +12088,7 @@
                 <w:color w:val="262B33"/>
                 <w:sz w:val="16"/>
               </w:rPr>
-              <w:t>Custom Made: Custom_Care_Coordination_Worksheet_Template.docx</w:t>
+              <w:t>Custom Made (Custom_Care_Coordination_Worksheet_Template.docx)</w:t>
             </w:r>
           </w:p>
         </w:tc>
@@ -12188,7 +12188,7 @@
                 <w:color w:val="262B33"/>
                 <w:sz w:val="16"/>
               </w:rPr>
-              <w:t>Custom Made: Custom_SNF_Intake_Medication_List_Template.docx</w:t>
+              <w:t>Custom Made (Custom_SNF_Intake_Medication_List_Template.docx)</w:t>
             </w:r>
           </w:p>
         </w:tc>
@@ -12288,7 +12288,7 @@
                 <w:color w:val="262B33"/>
                 <w:sz w:val="16"/>
               </w:rPr>
-              <w:t>Custom Made: Custom_Referral_Letter_Template.docx</w:t>
+              <w:t>Custom Made (Custom_Referral_Letter_Template.docx)</w:t>
             </w:r>
           </w:p>
         </w:tc>
@@ -12388,7 +12388,7 @@
                 <w:color w:val="262B33"/>
                 <w:sz w:val="16"/>
               </w:rPr>
-              <w:t>Custom Made: Custom_Payer_Denial_Letter_Template.docx</w:t>
+              <w:t>Custom Made (Custom_Payer_Denial_Letter_Template.docx)</w:t>
             </w:r>
           </w:p>
         </w:tc>
@@ -12488,7 +12488,7 @@
                 <w:color w:val="262B33"/>
                 <w:sz w:val="16"/>
               </w:rPr>
-              <w:t>Custom Made: Custom_Safety_Event_Intake_Template.docx</w:t>
+              <w:t>Custom Made (Custom_Safety_Event_Intake_Template.docx)</w:t>
             </w:r>
           </w:p>
         </w:tc>
@@ -12588,7 +12588,7 @@
                 <w:color w:val="262B33"/>
                 <w:sz w:val="16"/>
               </w:rPr>
-              <w:t>Custom Made: Custom_Quality_Abstraction_Worksheet_Template.docx</w:t>
+              <w:t>Custom Made (Custom_Quality_Abstraction_Worksheet_Template.docx)</w:t>
             </w:r>
           </w:p>
         </w:tc>
@@ -12688,7 +12688,7 @@
                 <w:color w:val="262B33"/>
                 <w:sz w:val="16"/>
               </w:rPr>
-              <w:t>Custom Made: Custom_CDI_Query_Memo_Template.docx</w:t>
+              <w:t>Custom Made (Custom_CDI_Query_Memo_Template.docx)</w:t>
             </w:r>
           </w:p>
         </w:tc>
@@ -12935,7 +12935,7 @@
                 <w:color w:val="262B33"/>
                 <w:sz w:val="16"/>
               </w:rPr>
-              <w:t>Databank Template: DB_Patient_Education_Documentation.docx</w:t>
+              <w:t>Databank Template (DB_Patient_Education_Documentation.docx)</w:t>
             </w:r>
           </w:p>
         </w:tc>
@@ -13035,7 +13035,7 @@
                 <w:color w:val="262B33"/>
                 <w:sz w:val="16"/>
               </w:rPr>
-              <w:t>Public Domain: CMS_Important_Message_From_Medicare_Blank.pdf (CMS)</w:t>
+              <w:t>Public Domain (Important Message from Medicare, CMS)</w:t>
             </w:r>
           </w:p>
         </w:tc>
@@ -13135,7 +13135,7 @@
                 <w:color w:val="262B33"/>
                 <w:sz w:val="16"/>
               </w:rPr>
-              <w:t>Custom Made: Custom_Nursing_Shift_Note_Template.docx</w:t>
+              <w:t>Custom Made (Custom_Nursing_Shift_Note_Template.docx)</w:t>
             </w:r>
           </w:p>
         </w:tc>
@@ -13235,7 +13235,7 @@
                 <w:color w:val="262B33"/>
                 <w:sz w:val="16"/>
               </w:rPr>
-              <w:t>Databank Template: DB_Informed_Consent.docx</w:t>
+              <w:t>Databank Template (DB_Informed_Consent.docx)</w:t>
             </w:r>
           </w:p>
         </w:tc>

</xml_diff>

<commit_message>
W3: rename DataBank templates to real catalog IDs (001..063) + adaptation notes in Reference File Origin
</commit_message>
<xml_diff>
--- a/worlds/marva-lydell/submission/Alexander_World_Marva_latest_6_20.docx
+++ b/worlds/marva-lydell/submission/Alexander_World_Marva_latest_6_20.docx
@@ -8341,7 +8341,7 @@
                 <w:color w:val="262B33"/>
                 <w:sz w:val="16"/>
               </w:rPr>
-              <w:t>Databank Template (DB_ED_Physician_Note.docx)</w:t>
+              <w:t>Databank Template (001_ED_PHYSICIAN_NOTE.docx; ED physician note)</w:t>
             </w:r>
           </w:p>
         </w:tc>
@@ -8441,7 +8441,7 @@
                 <w:color w:val="262B33"/>
                 <w:sz w:val="16"/>
               </w:rPr>
-              <w:t>Databank Template (DB_Admission_HP.docx)</w:t>
+              <w:t>Databank Template (002_ADMISSION_HP.docx; inpatient admission H and P)</w:t>
             </w:r>
           </w:p>
         </w:tc>
@@ -8541,7 +8541,7 @@
                 <w:color w:val="262B33"/>
                 <w:sz w:val="16"/>
               </w:rPr>
-              <w:t>Databank Template (DB_Progress_Note.docx)</w:t>
+              <w:t>Databank Template (003_PROGRESS_NOTE.docx; inpatient hospitalist progress note)</w:t>
             </w:r>
           </w:p>
         </w:tc>
@@ -8641,7 +8641,7 @@
                 <w:color w:val="262B33"/>
                 <w:sz w:val="16"/>
               </w:rPr>
-              <w:t>Databank Template (DB_Progress_Note.docx)</w:t>
+              <w:t>Databank Template (003_PROGRESS_NOTE.docx; inpatient hospitalist progress note)</w:t>
             </w:r>
           </w:p>
         </w:tc>
@@ -8741,7 +8741,7 @@
                 <w:color w:val="262B33"/>
                 <w:sz w:val="16"/>
               </w:rPr>
-              <w:t>Databank Template (DB_Progress_Note.docx)</w:t>
+              <w:t>Databank Template (003_PROGRESS_NOTE.docx; inpatient hospitalist progress note)</w:t>
             </w:r>
           </w:p>
         </w:tc>
@@ -8841,7 +8841,7 @@
                 <w:color w:val="262B33"/>
                 <w:sz w:val="16"/>
               </w:rPr>
-              <w:t>Databank Template (DB_Progress_Note.docx)</w:t>
+              <w:t>Databank Template (003_PROGRESS_NOTE.docx; inpatient hospitalist progress note)</w:t>
             </w:r>
           </w:p>
         </w:tc>
@@ -8941,7 +8941,7 @@
                 <w:color w:val="262B33"/>
                 <w:sz w:val="16"/>
               </w:rPr>
-              <w:t>Databank Template (DB_Consult_Note_Subspecialty.docx)</w:t>
+              <w:t>Databank Template (006_CONSULT_NOTE.docx; subspecialty consult, reused across cardiology, nephrology, pulmonology, endocrine)</w:t>
             </w:r>
           </w:p>
         </w:tc>
@@ -9041,7 +9041,7 @@
                 <w:color w:val="262B33"/>
                 <w:sz w:val="16"/>
               </w:rPr>
-              <w:t>Databank Template (DB_Consult_Note_Subspecialty.docx)</w:t>
+              <w:t>Databank Template (006_CONSULT_NOTE.docx; subspecialty consult, reused across cardiology, nephrology, pulmonology, endocrine)</w:t>
             </w:r>
           </w:p>
         </w:tc>
@@ -9141,7 +9141,7 @@
                 <w:color w:val="262B33"/>
                 <w:sz w:val="16"/>
               </w:rPr>
-              <w:t>Databank Template (DB_Consult_Note_Subspecialty.docx)</w:t>
+              <w:t>Databank Template (006_CONSULT_NOTE.docx; subspecialty consult, reused across cardiology, nephrology, pulmonology, endocrine)</w:t>
             </w:r>
           </w:p>
         </w:tc>
@@ -9241,7 +9241,7 @@
                 <w:color w:val="262B33"/>
                 <w:sz w:val="16"/>
               </w:rPr>
-              <w:t>Databank Template (DB_Respiratory_Therapy_Note.docx)</w:t>
+              <w:t>Databank Template (061_RESPIRATORY_THERAPY_NOTE.docx; respiratory therapy note, oxygen titration and walk test)</w:t>
             </w:r>
           </w:p>
         </w:tc>
@@ -9341,7 +9341,7 @@
                 <w:color w:val="262B33"/>
                 <w:sz w:val="16"/>
               </w:rPr>
-              <w:t>Databank Template (DB_PT_OT_Speech_Therapy_Evaluation.docx)</w:t>
+              <w:t>Databank Template (059_PT_OT_SPEECH_THERAPY_EVALUATION.docx; combined PT, OT, speech therapy evaluation)</w:t>
             </w:r>
           </w:p>
         </w:tc>
@@ -9441,7 +9441,7 @@
                 <w:color w:val="262B33"/>
                 <w:sz w:val="16"/>
               </w:rPr>
-              <w:t>Databank Template (DB_PT_OT_Speech_Therapy_Evaluation.docx)</w:t>
+              <w:t>Databank Template (059_PT_OT_SPEECH_THERAPY_EVALUATION.docx; combined PT, OT, speech therapy evaluation)</w:t>
             </w:r>
           </w:p>
         </w:tc>
@@ -9541,7 +9541,7 @@
                 <w:color w:val="262B33"/>
                 <w:sz w:val="16"/>
               </w:rPr>
-              <w:t>Databank Template (DB_Case_Management_Note.docx)</w:t>
+              <w:t>Databank Template (063_CASE_MANAGEMENT_NOTE.docx; case management and discharge planning note)</w:t>
             </w:r>
           </w:p>
         </w:tc>
@@ -9941,7 +9941,7 @@
                 <w:color w:val="262B33"/>
                 <w:sz w:val="16"/>
               </w:rPr>
-              <w:t>Databank Template (DB_Nursing_Flowsheet_Summary.docx)</w:t>
+              <w:t>Databank Template (056_NURSING_FLOWSHEET_SUMMARY.docx; nursing flowsheet, vitals, weights, intake-output, oxygen)</w:t>
             </w:r>
           </w:p>
         </w:tc>
@@ -10041,7 +10041,7 @@
                 <w:color w:val="262B33"/>
                 <w:sz w:val="16"/>
               </w:rPr>
-              <w:t>Databank Template (DB_Nursing_Flowsheet_Summary.docx)</w:t>
+              <w:t>Databank Template (056_NURSING_FLOWSHEET_SUMMARY.docx; nursing flowsheet, vitals, weights, intake-output, oxygen)</w:t>
             </w:r>
           </w:p>
         </w:tc>
@@ -10141,7 +10141,7 @@
                 <w:color w:val="262B33"/>
                 <w:sz w:val="16"/>
               </w:rPr>
-              <w:t>Databank Template (DB_Echocardiogram_Report.docx)</w:t>
+              <w:t>Databank Template (045_ECHOCARDIOGRAM_REPORT.docx; echocardiogram report)</w:t>
             </w:r>
           </w:p>
         </w:tc>
@@ -10241,7 +10241,7 @@
                 <w:color w:val="262B33"/>
                 <w:sz w:val="16"/>
               </w:rPr>
-              <w:t>Databank Template (DB_Radiology_Report.docx)</w:t>
+              <w:t>Databank Template (044_RADIOLOGY_REPORT.docx; radiology report)</w:t>
             </w:r>
           </w:p>
         </w:tc>
@@ -10341,7 +10341,7 @@
                 <w:color w:val="262B33"/>
                 <w:sz w:val="16"/>
               </w:rPr>
-              <w:t>Databank Template (DB_ECG_Interpretation.docx)</w:t>
+              <w:t>Databank Template (048_ECG_INTERPRETATION.docx; 12-lead ECG report)</w:t>
             </w:r>
           </w:p>
         </w:tc>
@@ -10541,7 +10541,7 @@
                 <w:color w:val="262B33"/>
                 <w:sz w:val="16"/>
               </w:rPr>
-              <w:t>Databank Template (DB_EMR_Medication_List.docx)</w:t>
+              <w:t>Databank Template (012_EMR_MEDICATION_LIST.docx; system-generated EMR medication list)</w:t>
             </w:r>
           </w:p>
         </w:tc>
@@ -10841,7 +10841,7 @@
                 <w:color w:val="262B33"/>
                 <w:sz w:val="16"/>
               </w:rPr>
-              <w:t>Databank Template (DB_Consult_Note_Subspecialty.docx)</w:t>
+              <w:t>Databank Template (006_CONSULT_NOTE.docx; subspecialty consult, reused across cardiology, nephrology, pulmonology, endocrine)</w:t>
             </w:r>
           </w:p>
         </w:tc>
@@ -10941,7 +10941,7 @@
                 <w:color w:val="262B33"/>
                 <w:sz w:val="16"/>
               </w:rPr>
-              <w:t>Databank Template (DB_Nursing_Flowsheet_Summary.docx)</w:t>
+              <w:t>Databank Template (056_NURSING_FLOWSHEET_SUMMARY.docx; nursing flowsheet, vitals, weights, intake-output, oxygen)</w:t>
             </w:r>
           </w:p>
         </w:tc>
@@ -11041,7 +11041,7 @@
                 <w:color w:val="262B33"/>
                 <w:sz w:val="16"/>
               </w:rPr>
-              <w:t>Databank Template (DB_Office_Visit_Note.docx)</w:t>
+              <w:t>Databank Template (024_OFFICE_VISIT_NOTE.docx; outpatient office visit note)</w:t>
             </w:r>
           </w:p>
         </w:tc>
@@ -11141,7 +11141,7 @@
                 <w:color w:val="262B33"/>
                 <w:sz w:val="16"/>
               </w:rPr>
-              <w:t>Databank Template (DB_Echocardiogram_Report.docx)</w:t>
+              <w:t>Databank Template (045_ECHOCARDIOGRAM_REPORT.docx; echocardiogram report)</w:t>
             </w:r>
           </w:p>
         </w:tc>
@@ -11241,7 +11241,7 @@
                 <w:color w:val="262B33"/>
                 <w:sz w:val="16"/>
               </w:rPr>
-              <w:t>Databank Template (DB_Progress_Note.docx)</w:t>
+              <w:t>Databank Template (003_PROGRESS_NOTE.docx; inpatient hospitalist progress note)</w:t>
             </w:r>
           </w:p>
         </w:tc>
@@ -11341,7 +11341,7 @@
                 <w:color w:val="262B33"/>
                 <w:sz w:val="16"/>
               </w:rPr>
-              <w:t>Databank Template (DB_Social_Work_Note.docx)</w:t>
+              <w:t>Databank Template (062_SOCIAL_WORK_NOTE.docx; social work note)</w:t>
             </w:r>
           </w:p>
         </w:tc>
@@ -12935,7 +12935,7 @@
                 <w:color w:val="262B33"/>
                 <w:sz w:val="16"/>
               </w:rPr>
-              <w:t>Databank Template (DB_Patient_Education_Documentation.docx)</w:t>
+              <w:t>Databank Template (058_PATIENT_EDUCATION_DOCUMENTATION.docx; patient education documentation)</w:t>
             </w:r>
           </w:p>
         </w:tc>
@@ -13235,7 +13235,7 @@
                 <w:color w:val="262B33"/>
                 <w:sz w:val="16"/>
               </w:rPr>
-              <w:t>Databank Template (DB_Informed_Consent.docx)</w:t>
+              <w:t>Databank Template (009_INFORMED_CONSENT.docx; informed consent documentation)</w:t>
             </w:r>
           </w:p>
         </w:tc>

</xml_diff>

<commit_message>
W3: rearrange world-spec header to canonical Soya layout (codename banner, title, info rows, 5-col footer)
</commit_message>
<xml_diff>
--- a/worlds/marva-lydell/submission/Alexander_World_Marva_latest_6_20.docx
+++ b/worlds/marva-lydell/submission/Alexander_World_Marva_latest_6_20.docx
@@ -16,13 +16,18 @@
         </w:tblBorders>
       </w:tblPr>
       <w:tblGrid>
-        <w:gridCol w:w="10080"/>
+        <w:gridCol w:w="2016"/>
+        <w:gridCol w:w="2016"/>
+        <w:gridCol w:w="2016"/>
+        <w:gridCol w:w="2016"/>
+        <w:gridCol w:w="2016"/>
       </w:tblGrid>
       <w:tr>
         <w:tc>
           <w:tcPr>
             <w:tcW w:type="dxa" w:w="10080"/>
-            <w:shd w:val="clear" w:color="auto" w:fill="D6E4F0"/>
+            <w:gridSpan w:val="5"/>
+            <w:shd w:val="clear" w:color="auto" w:fill="4472C4"/>
           </w:tcPr>
           <w:p>
             <w:pPr>
@@ -31,372 +36,208 @@
             <w:r>
               <w:rPr>
                 <w:b/>
-                <w:color w:val="4472C4"/>
+                <w:color w:val="FFFFFF"/>
                 <w:sz w:val="32"/>
               </w:rPr>
-              <w:t>MARVA LYDELL WORLD SPECIFICATION DOCUMENT</w:t>
-            </w:r>
-          </w:p>
+              <w:t>HEALTHCARE_CardiorenalTransition_Marva</w:t>
+            </w:r>
+          </w:p>
+        </w:tc>
+      </w:tr>
+      <w:tr>
+        <w:tc>
+          <w:tcPr>
+            <w:tcW w:type="dxa" w:w="10080"/>
+            <w:gridSpan w:val="5"/>
+            <w:shd w:val="clear" w:color="auto" w:fill="D6E4F0"/>
+          </w:tcPr>
           <w:p>
             <w:pPr>
               <w:jc w:val="center"/>
             </w:pPr>
             <w:r>
               <w:rPr>
-                <w:color w:val="666666"/>
+                <w:b/>
+                <w:color w:val="262B33"/>
                 <w:sz w:val="20"/>
               </w:rPr>
-              <w:t>World Title: Cardiorenal Respiratory Transition | World Type: Typical Clinical World | Snapshot: June 19, 2025 at 18:00 | 10 Tasks</w:t>
-            </w:r>
-          </w:p>
+              <w:t>Navigating Transition Readiness and Discharge Safety in Decompensated Heart Failure with Cardiorenal and Respiratory Complexity</w:t>
+            </w:r>
+          </w:p>
+        </w:tc>
+      </w:tr>
+      <w:tr>
+        <w:tc>
+          <w:tcPr>
+            <w:tcW w:type="dxa" w:w="10080"/>
+            <w:gridSpan w:val="5"/>
+            <w:shd w:val="clear" w:color="auto" w:fill="D6E4F0"/>
+          </w:tcPr>
           <w:p>
             <w:pPr>
               <w:jc w:val="center"/>
             </w:pPr>
             <w:r>
               <w:rPr>
-                <w:color w:val="666666"/>
-                <w:sz w:val="20"/>
-              </w:rPr>
-              <w:t>Clinical domain: inpatient hospital medicine, cardiology and nephrology, respiratory and post-acute transition, payer and documentation operations | Project Sanctum | Version 1.0 | June 27, 2025</w:t>
-            </w:r>
-          </w:p>
-        </w:tc>
-      </w:tr>
-    </w:tbl>
-    <w:tbl>
-      <w:tblPr>
-        <w:tblW w:type="auto" w:w="0"/>
-        <w:tblLook w:firstColumn="1" w:firstRow="1" w:lastColumn="0" w:lastRow="0" w:noHBand="0" w:noVBand="1" w:val="04A0"/>
-        <w:tblBorders>
-          <w:top w:val="single" w:sz="4" w:space="0" w:color="000000"/>
-          <w:left w:val="single" w:sz="4" w:space="0" w:color="000000"/>
-          <w:bottom w:val="single" w:sz="4" w:space="0" w:color="000000"/>
-          <w:right w:val="single" w:sz="4" w:space="0" w:color="000000"/>
-          <w:insideH w:val="single" w:sz="4" w:space="0" w:color="CCCCCC"/>
-          <w:insideV w:val="single" w:sz="4" w:space="0" w:color="CCCCCC"/>
-        </w:tblBorders>
-      </w:tblPr>
-      <w:tblGrid>
-        <w:gridCol w:w="5040"/>
-        <w:gridCol w:w="5040"/>
-      </w:tblGrid>
-      <w:tr>
-        <w:tc>
-          <w:tcPr>
-            <w:tcW w:type="dxa" w:w="5040"/>
+                <w:color w:val="262B33"/>
+                <w:sz w:val="16"/>
+              </w:rPr>
+              <w:t>Patient: Marva Lydell (fictional)</w:t>
+            </w:r>
+          </w:p>
+        </w:tc>
+      </w:tr>
+      <w:tr>
+        <w:tc>
+          <w:tcPr>
+            <w:tcW w:type="dxa" w:w="10080"/>
+            <w:gridSpan w:val="5"/>
             <w:shd w:val="clear" w:color="auto" w:fill="D6E4F0"/>
           </w:tcPr>
           <w:p>
-            <w:r>
-              <w:rPr>
-                <w:b/>
-                <w:color w:val="262B33"/>
-                <w:sz w:val="16"/>
-              </w:rPr>
-              <w:t>Field</w:t>
-            </w:r>
-          </w:p>
-        </w:tc>
-        <w:tc>
-          <w:tcPr>
-            <w:tcW w:type="dxa" w:w="5040"/>
-          </w:tcPr>
-          <w:p>
-            <w:r>
-              <w:rPr>
-                <w:color w:val="262B33"/>
-                <w:sz w:val="16"/>
-              </w:rPr>
-              <w:t>Value</w:t>
-            </w:r>
-          </w:p>
-        </w:tc>
-      </w:tr>
-      <w:tr>
-        <w:tc>
-          <w:tcPr>
-            <w:tcW w:type="dxa" w:w="5040"/>
+            <w:pPr>
+              <w:jc w:val="center"/>
+            </w:pPr>
+            <w:r>
+              <w:rPr>
+                <w:color w:val="262B33"/>
+                <w:sz w:val="16"/>
+              </w:rPr>
+              <w:t>World Type: Typical Clinical</w:t>
+            </w:r>
+          </w:p>
+        </w:tc>
+      </w:tr>
+      <w:tr>
+        <w:tc>
+          <w:tcPr>
+            <w:tcW w:type="dxa" w:w="10080"/>
+            <w:gridSpan w:val="5"/>
             <w:shd w:val="clear" w:color="auto" w:fill="D6E4F0"/>
           </w:tcPr>
           <w:p>
-            <w:r>
-              <w:rPr>
-                <w:b/>
-                <w:color w:val="262B33"/>
-                <w:sz w:val="16"/>
-              </w:rPr>
-              <w:t>World Title</w:t>
-            </w:r>
-          </w:p>
-        </w:tc>
-        <w:tc>
-          <w:tcPr>
-            <w:tcW w:type="dxa" w:w="5040"/>
-          </w:tcPr>
-          <w:p>
-            <w:r>
-              <w:rPr>
-                <w:color w:val="262B33"/>
-                <w:sz w:val="16"/>
-              </w:rPr>
-              <w:t>Cardiorenal Respiratory Transition</w:t>
-            </w:r>
-          </w:p>
-        </w:tc>
-      </w:tr>
-      <w:tr>
-        <w:tc>
-          <w:tcPr>
-            <w:tcW w:type="dxa" w:w="5040"/>
+            <w:pPr>
+              <w:jc w:val="center"/>
+            </w:pPr>
+            <w:r>
+              <w:rPr>
+                <w:color w:val="262B33"/>
+                <w:sz w:val="16"/>
+              </w:rPr>
+              <w:t>Setting: Inpatient hospital medicine with post-discharge administrative and transition encounters</w:t>
+            </w:r>
+          </w:p>
+        </w:tc>
+      </w:tr>
+      <w:tr>
+        <w:tc>
+          <w:tcPr>
+            <w:tcW w:type="dxa" w:w="10080"/>
+            <w:gridSpan w:val="5"/>
             <w:shd w:val="clear" w:color="auto" w:fill="D6E4F0"/>
           </w:tcPr>
           <w:p>
-            <w:r>
-              <w:rPr>
-                <w:b/>
-                <w:color w:val="262B33"/>
-                <w:sz w:val="16"/>
-              </w:rPr>
-              <w:t>Patient</w:t>
-            </w:r>
-          </w:p>
-        </w:tc>
-        <w:tc>
-          <w:tcPr>
-            <w:tcW w:type="dxa" w:w="5040"/>
-          </w:tcPr>
-          <w:p>
-            <w:r>
-              <w:rPr>
-                <w:color w:val="262B33"/>
-                <w:sz w:val="16"/>
-              </w:rPr>
-              <w:t>Marva Lydell</w:t>
-            </w:r>
-          </w:p>
-        </w:tc>
-      </w:tr>
-      <w:tr>
-        <w:tc>
-          <w:tcPr>
-            <w:tcW w:type="dxa" w:w="5040"/>
+            <w:pPr>
+              <w:jc w:val="center"/>
+            </w:pPr>
+            <w:r>
+              <w:rPr>
+                <w:color w:val="262B33"/>
+                <w:sz w:val="16"/>
+              </w:rPr>
+              <w:t>Workflows: Claims Appeal, Medication Reconciliation, Utilization Review, Transition Documentation, Acute Care Discharge Planning, Specialist Referral, Root Cause Analysis, Quality Abstraction, Clinical Documentation Query</w:t>
+            </w:r>
+          </w:p>
+        </w:tc>
+      </w:tr>
+      <w:tr>
+        <w:tc>
+          <w:tcPr>
+            <w:tcW w:type="dxa" w:w="1872"/>
             <w:shd w:val="clear" w:color="auto" w:fill="D6E4F0"/>
           </w:tcPr>
           <w:p>
-            <w:r>
-              <w:rPr>
-                <w:b/>
-                <w:color w:val="262B33"/>
-                <w:sz w:val="16"/>
-              </w:rPr>
-              <w:t>World Type</w:t>
-            </w:r>
-          </w:p>
-        </w:tc>
-        <w:tc>
-          <w:tcPr>
-            <w:tcW w:type="dxa" w:w="5040"/>
-          </w:tcPr>
-          <w:p>
-            <w:r>
-              <w:rPr>
-                <w:color w:val="262B33"/>
-                <w:sz w:val="16"/>
-              </w:rPr>
-              <w:t>Typical Clinical World</w:t>
-            </w:r>
-          </w:p>
-        </w:tc>
-      </w:tr>
-      <w:tr>
-        <w:tc>
-          <w:tcPr>
-            <w:tcW w:type="dxa" w:w="5040"/>
+            <w:pPr>
+              <w:jc w:val="center"/>
+            </w:pPr>
+            <w:r>
+              <w:rPr>
+                <w:color w:val="262B33"/>
+                <w:sz w:val="16"/>
+              </w:rPr>
+              <w:t>Hospital Medicine</w:t>
+            </w:r>
+          </w:p>
+        </w:tc>
+        <w:tc>
+          <w:tcPr>
+            <w:tcW w:type="dxa" w:w="1872"/>
             <w:shd w:val="clear" w:color="auto" w:fill="D6E4F0"/>
           </w:tcPr>
           <w:p>
-            <w:r>
-              <w:rPr>
-                <w:b/>
-                <w:color w:val="262B33"/>
-                <w:sz w:val="16"/>
-              </w:rPr>
-              <w:t>Setting</w:t>
-            </w:r>
-          </w:p>
-        </w:tc>
-        <w:tc>
-          <w:tcPr>
-            <w:tcW w:type="dxa" w:w="5040"/>
-          </w:tcPr>
-          <w:p>
-            <w:r>
-              <w:rPr>
-                <w:color w:val="262B33"/>
-                <w:sz w:val="16"/>
-              </w:rPr>
-              <w:t>Inpatient hospital medicine with post-discharge administrative and transition encounters</w:t>
-            </w:r>
-          </w:p>
-        </w:tc>
-      </w:tr>
-      <w:tr>
-        <w:tc>
-          <w:tcPr>
-            <w:tcW w:type="dxa" w:w="5040"/>
+            <w:pPr>
+              <w:jc w:val="center"/>
+            </w:pPr>
+            <w:r>
+              <w:rPr>
+                <w:color w:val="262B33"/>
+                <w:sz w:val="16"/>
+              </w:rPr>
+              <w:t>10 Tasks</w:t>
+            </w:r>
+          </w:p>
+        </w:tc>
+        <w:tc>
+          <w:tcPr>
+            <w:tcW w:type="dxa" w:w="1872"/>
             <w:shd w:val="clear" w:color="auto" w:fill="D6E4F0"/>
           </w:tcPr>
           <w:p>
-            <w:r>
-              <w:rPr>
-                <w:b/>
-                <w:color w:val="262B33"/>
-                <w:sz w:val="16"/>
-              </w:rPr>
-              <w:t>Specialty / Workflow</w:t>
-            </w:r>
-          </w:p>
-        </w:tc>
-        <w:tc>
-          <w:tcPr>
-            <w:tcW w:type="dxa" w:w="5040"/>
-          </w:tcPr>
-          <w:p>
-            <w:r>
-              <w:rPr>
-                <w:color w:val="262B33"/>
-                <w:sz w:val="16"/>
-              </w:rPr>
-              <w:t>Hospital Medicine, Cardiology and Nephrology, Respiratory and Post-Acute Transition, Payer and Documentation Operations</w:t>
-            </w:r>
-          </w:p>
-        </w:tc>
-      </w:tr>
-      <w:tr>
-        <w:tc>
-          <w:tcPr>
-            <w:tcW w:type="dxa" w:w="5040"/>
+            <w:pPr>
+              <w:jc w:val="center"/>
+            </w:pPr>
+            <w:r>
+              <w:rPr>
+                <w:color w:val="262B33"/>
+                <w:sz w:val="16"/>
+              </w:rPr>
+              <w:t>Project Sanctum</w:t>
+            </w:r>
+          </w:p>
+        </w:tc>
+        <w:tc>
+          <w:tcPr>
+            <w:tcW w:type="dxa" w:w="1872"/>
             <w:shd w:val="clear" w:color="auto" w:fill="D6E4F0"/>
           </w:tcPr>
           <w:p>
-            <w:r>
-              <w:rPr>
-                <w:b/>
-                <w:color w:val="262B33"/>
-                <w:sz w:val="16"/>
-              </w:rPr>
-              <w:t>Total Tasks</w:t>
-            </w:r>
-          </w:p>
-        </w:tc>
-        <w:tc>
-          <w:tcPr>
-            <w:tcW w:type="dxa" w:w="5040"/>
-          </w:tcPr>
-          <w:p>
-            <w:r>
-              <w:rPr>
-                <w:color w:val="262B33"/>
-                <w:sz w:val="16"/>
-              </w:rPr>
-              <w:t>10</w:t>
-            </w:r>
-          </w:p>
-        </w:tc>
-      </w:tr>
-      <w:tr>
-        <w:tc>
-          <w:tcPr>
-            <w:tcW w:type="dxa" w:w="5040"/>
+            <w:pPr>
+              <w:jc w:val="center"/>
+            </w:pPr>
+            <w:r>
+              <w:rPr>
+                <w:color w:val="262B33"/>
+                <w:sz w:val="16"/>
+              </w:rPr>
+              <w:t>Version 1.0</w:t>
+            </w:r>
+          </w:p>
+        </w:tc>
+        <w:tc>
+          <w:tcPr>
+            <w:tcW w:type="dxa" w:w="1872"/>
             <w:shd w:val="clear" w:color="auto" w:fill="D6E4F0"/>
           </w:tcPr>
           <w:p>
-            <w:r>
-              <w:rPr>
-                <w:b/>
-                <w:color w:val="262B33"/>
-                <w:sz w:val="16"/>
-              </w:rPr>
-              <w:t>Project</w:t>
-            </w:r>
-          </w:p>
-        </w:tc>
-        <w:tc>
-          <w:tcPr>
-            <w:tcW w:type="dxa" w:w="5040"/>
-          </w:tcPr>
-          <w:p>
-            <w:r>
-              <w:rPr>
-                <w:color w:val="262B33"/>
-                <w:sz w:val="16"/>
-              </w:rPr>
-              <w:t>Project Sanctum</w:t>
-            </w:r>
-          </w:p>
-        </w:tc>
-      </w:tr>
-      <w:tr>
-        <w:tc>
-          <w:tcPr>
-            <w:tcW w:type="dxa" w:w="5040"/>
-            <w:shd w:val="clear" w:color="auto" w:fill="D6E4F0"/>
-          </w:tcPr>
-          <w:p>
-            <w:r>
-              <w:rPr>
-                <w:b/>
-                <w:color w:val="262B33"/>
-                <w:sz w:val="16"/>
-              </w:rPr>
-              <w:t>Version</w:t>
-            </w:r>
-          </w:p>
-        </w:tc>
-        <w:tc>
-          <w:tcPr>
-            <w:tcW w:type="dxa" w:w="5040"/>
-          </w:tcPr>
-          <w:p>
-            <w:r>
-              <w:rPr>
-                <w:color w:val="262B33"/>
-                <w:sz w:val="16"/>
-              </w:rPr>
-              <w:t>1.0</w:t>
-            </w:r>
-          </w:p>
-        </w:tc>
-      </w:tr>
-      <w:tr>
-        <w:tc>
-          <w:tcPr>
-            <w:tcW w:type="dxa" w:w="5040"/>
-            <w:shd w:val="clear" w:color="auto" w:fill="D6E4F0"/>
-          </w:tcPr>
-          <w:p>
-            <w:r>
-              <w:rPr>
-                <w:b/>
-                <w:color w:val="262B33"/>
-                <w:sz w:val="16"/>
-              </w:rPr>
-              <w:t>Document date</w:t>
-            </w:r>
-          </w:p>
-        </w:tc>
-        <w:tc>
-          <w:tcPr>
-            <w:tcW w:type="dxa" w:w="5040"/>
-          </w:tcPr>
-          <w:p>
-            <w:r>
-              <w:rPr>
-                <w:color w:val="262B33"/>
-                <w:sz w:val="16"/>
-              </w:rPr>
-              <w:t>June 27, 2025</w:t>
+            <w:pPr>
+              <w:jc w:val="center"/>
+            </w:pPr>
+            <w:r>
+              <w:rPr>
+                <w:color w:val="262B33"/>
+                <w:sz w:val="16"/>
+              </w:rPr>
+              <w:t>06/27/2025</w:t>
             </w:r>
           </w:p>
         </w:tc>

</xml_diff>

<commit_message>
W3 header: blend borders to table palette (4472C4/CCCCCC); relax clone gate to subset-of-base
</commit_message>
<xml_diff>
--- a/worlds/marva-lydell/submission/Alexander_World_Marva_latest_6_20.docx
+++ b/worlds/marva-lydell/submission/Alexander_World_Marva_latest_6_20.docx
@@ -7,12 +7,12 @@
         <w:tblW w:type="auto" w:w="0"/>
         <w:tblLook w:firstColumn="1" w:firstRow="1" w:lastColumn="0" w:lastRow="0" w:noHBand="0" w:noVBand="1" w:val="04A0"/>
         <w:tblBorders>
-          <w:top w:val="single" w:sz="4" w:space="0" w:color="000000"/>
-          <w:left w:val="single" w:sz="4" w:space="0" w:color="000000"/>
-          <w:bottom w:val="single" w:sz="4" w:space="0" w:color="000000"/>
-          <w:right w:val="single" w:sz="4" w:space="0" w:color="000000"/>
-          <w:insideH w:val="single" w:sz="4" w:space="0" w:color="000000"/>
-          <w:insideV w:val="single" w:sz="4" w:space="0" w:color="000000"/>
+          <w:top w:val="single" w:sz="4" w:space="0" w:color="4472C4"/>
+          <w:left w:val="single" w:sz="4" w:space="0" w:color="4472C4"/>
+          <w:bottom w:val="single" w:sz="4" w:space="0" w:color="4472C4"/>
+          <w:right w:val="single" w:sz="4" w:space="0" w:color="4472C4"/>
+          <w:insideH w:val="single" w:sz="4" w:space="0" w:color="CCCCCC"/>
+          <w:insideV w:val="single" w:sz="4" w:space="0" w:color="CCCCCC"/>
         </w:tblBorders>
       </w:tblPr>
       <w:tblGrid>

</xml_diff>

<commit_message>
W3: apply OV10 recommendation - redesign Task 4 (note peer review) + Task 6 (full-authorship referral) off the completion format
</commit_message>
<xml_diff>
--- a/worlds/marva-lydell/submission/Alexander_World_Marva_latest_6_20.docx
+++ b/worlds/marva-lydell/submission/Alexander_World_Marva_latest_6_20.docx
@@ -276,7 +276,7 @@
           <w:color w:val="262B33"/>
           <w:sz w:val="16"/>
         </w:rPr>
-        <w:t>The world carries ten independent post-snapshot tasks spanning payer appeals, discharge medication reconciliation, a utilization determination, a completion task, post-acute coordination, a specialist referral handoff, a safety corrective-action review, quality abstraction, and a documentation-integrity query response. The integration anchor is Task 1, the oxygen and skilled-nursing denial appeal, which draws the widest synthesis across resting versus exertional oxygen, functional tolerance, equipment delivery, and home support. File-plan composition: 32 essential world-level files plus 11 essential task-level files plus 4 supplementary world-level files, for 47 unique files supporting the ten tasks.</w:t>
+        <w:t>The world carries ten independent post-snapshot tasks spanning payer appeals, discharge medication reconciliation, a utilization determination, a transition-note peer review, post-acute coordination, a specialist referral handoff, a safety corrective-action review, quality abstraction, and a documentation-integrity query response. The integration anchor is Task 1, the oxygen and skilled-nursing denial appeal, which draws the widest synthesis across resting versus exertional oxygen, functional tolerance, equipment delivery, and home support. File-plan composition: 32 essential world-level files plus 11 essential task-level files plus 4 supplementary world-level files, for 47 unique files supporting the ten tasks.</w:t>
       </w:r>
     </w:p>
     <w:p>
@@ -4627,7 +4627,7 @@
                 <w:color w:val="262B33"/>
                 <w:sz w:val="16"/>
               </w:rPr>
-              <w:t>Task 4, transition note completion</w:t>
+              <w:t>Task 4, transition note peer review</w:t>
             </w:r>
           </w:p>
         </w:tc>
@@ -5819,7 +5819,7 @@
         <w:pStyle w:val="Heading2"/>
       </w:pPr>
       <w:r>
-        <w:t>Task 4: Transition Note Completion</w:t>
+        <w:t>Task 4: Transition Note Peer Review</w:t>
       </w:r>
     </w:p>
     <w:p>
@@ -5829,7 +5829,7 @@
           <w:color w:val="262B33"/>
           <w:sz w:val="16"/>
         </w:rPr>
-        <w:t>Capability: completion with true placeholders on the scored decisions, with a buried held-medication line.</w:t>
+        <w:t>Capability: an attending patient-safety review of a complete signed resident note that carries two common, realistic errors the reviewer must catch before sign-off.</w:t>
       </w:r>
     </w:p>
     <w:p>
@@ -5839,7 +5839,7 @@
           <w:color w:val="262B33"/>
           <w:sz w:val="16"/>
         </w:rPr>
-        <w:t>Workflow: Medical Transcription and Clinical Documentation Completion, requested by the discharging attending.</w:t>
+        <w:t>Workflow: Peer Review and Patient Safety Documentation Review, requested by the supervising hospitalist attending. New approved-category lane replacing the deprecated completion lane; confirm the verbatim string with the lead.</w:t>
       </w:r>
     </w:p>
     <w:p>
@@ -5849,7 +5849,7 @@
           <w:color w:val="262B33"/>
           <w:sz w:val="19"/>
         </w:rPr>
-        <w:t>Anchor: 06/21/2025 at 08:30. Priority: P0. Difficulty: high. Time estimate: 25 to 35 minutes, completing the placeholders from the respiratory, renal, and medication documentation.</w:t>
+        <w:t>Anchor: 06/21/2025 at 08:30. Priority: P0. Difficulty: high. Time estimate: 25 to 35 minutes, reviewing the signed note against the respiratory, renal, and medication documentation.</w:t>
       </w:r>
     </w:p>
     <w:p>
@@ -5859,7 +5859,7 @@
           <w:color w:val="262B33"/>
           <w:sz w:val="16"/>
         </w:rPr>
-        <w:t>Expected Output: a finalized transition-of-care note completed from a started draft. Format: a finalized transition-of-care note. Register: hospitalist documentation. Length: 400 to 650 words. The started draft is complete except the oxygen, fluid-status, and follow-up-ownership sections, which are left as true placeholders to complete from the chart; correct responses fill them with the documented exertional-oxygen reality and portable-oxygen requirement, the still-active diuresis and renal picture, and the deferred held-medication restarts assigned to named follow-up owners, and they do not rubber-stamp the draft's background discharge-medication line that would silently resume the held agents. Nothing the chart leaves open is closed. Grader anchors: the oxygen section completed with the exertional desaturation and portable-oxygen need, not a routine clearance; the held agents kept as explicit deferred restarts with owners, not silently resumed; volume and follow-up ownership left open where the chart is open; the home sliding-scale insulin de-escalated; the rest of the draft finalized faithfully.</w:t>
+        <w:t>Expected Output: a peer-review memo on the resident's signed transition-of-care note that identifies the unsafe items and states the correct handling. Format: a structured peer-review note, one finding and recommendation per issue. Register: attending peer review. Length: 400 to 650 words. The resident note (E1-T4) is complete and signed, but it clears the patient on oxygen as stable on the home setup and silently resumes the held cardiorenal and diabetes agents at discharge. Correct responses catch the oxygen error against the documented exertional desaturation and portable-oxygen requirement, catch the silent resumption of empagliflozin, spironolactone, losartan, and metformin and keep them as deferred restarts assigned to named owners, flag the volume status and follow-up ownership the note closes that the chart leaves open, note the home sliding-scale insulin de-escalation, and confirm the rest of the note is accurate rather than re-litigating it. Grader anchors: the oxygen clearance flagged and corrected to the exertional-desaturation and portable-oxygen reality; the silent held-agent resumption flagged and corrected to deferred, parameter-gated restarts with owners; the prematurely closed volume and follow-up items reopened; the home sliding-scale insulin de-escalation noted; the accurate remainder confirmed.</w:t>
       </w:r>
     </w:p>
     <w:p>
@@ -5934,141 +5934,141 @@
                 <w:color w:val="262B33"/>
                 <w:sz w:val="16"/>
               </w:rPr>
-              <w:t>A background discharge-medication line silently resumes the held agents (shared world-level trap; primary here)</w:t>
-            </w:r>
-          </w:p>
-        </w:tc>
-        <w:tc>
-          <w:tcPr>
-            <w:tcW w:type="dxa" w:w="5040"/>
-          </w:tcPr>
-          <w:p>
-            <w:r>
-              <w:rPr>
-                <w:color w:val="262B33"/>
-                <w:sz w:val="16"/>
-              </w:rPr>
-              <w:t>Keep empagliflozin, spironolactone, losartan, metformin as explicit deferred restarts assigned to nephrology and primary care, not resumed by default (06/13, 06/15; hold orders, nephrology note)</w:t>
-            </w:r>
-          </w:p>
-        </w:tc>
-      </w:tr>
-      <w:tr>
-        <w:tc>
-          <w:tcPr>
-            <w:tcW w:type="dxa" w:w="5040"/>
-          </w:tcPr>
-          <w:p>
-            <w:r>
-              <w:rPr>
-                <w:color w:val="262B33"/>
-                <w:sz w:val="16"/>
-              </w:rPr>
-              <w:t>Oxygen section filled with a routine clearance</w:t>
-            </w:r>
-          </w:p>
-        </w:tc>
-        <w:tc>
-          <w:tcPr>
-            <w:tcW w:type="dxa" w:w="5040"/>
-          </w:tcPr>
-          <w:p>
-            <w:r>
-              <w:rPr>
-                <w:color w:val="262B33"/>
-                <w:sz w:val="16"/>
-              </w:rPr>
-              <w:t>Complete it with the documented exertional desaturation and the portable-oxygen requirement (06/17; respiratory therapy walk test, OT)</w:t>
-            </w:r>
-          </w:p>
-        </w:tc>
-      </w:tr>
-      <w:tr>
-        <w:tc>
-          <w:tcPr>
-            <w:tcW w:type="dxa" w:w="5040"/>
-          </w:tcPr>
-          <w:p>
-            <w:r>
-              <w:rPr>
-                <w:color w:val="262B33"/>
-                <w:sz w:val="16"/>
-              </w:rPr>
-              <w:t>A still-open decision asserted as closed</w:t>
-            </w:r>
-          </w:p>
-        </w:tc>
-        <w:tc>
-          <w:tcPr>
-            <w:tcW w:type="dxa" w:w="5040"/>
-          </w:tcPr>
-          <w:p>
-            <w:r>
-              <w:rPr>
-                <w:color w:val="262B33"/>
-                <w:sz w:val="16"/>
-              </w:rPr>
-              <w:t>Leave volume status and follow-up ownership open where the chart is open (full chart)</w:t>
-            </w:r>
-          </w:p>
-        </w:tc>
-      </w:tr>
-      <w:tr>
-        <w:tc>
-          <w:tcPr>
-            <w:tcW w:type="dxa" w:w="5040"/>
-          </w:tcPr>
-          <w:p>
-            <w:r>
-              <w:rPr>
-                <w:color w:val="262B33"/>
-                <w:sz w:val="16"/>
-              </w:rPr>
-              <w:t>Home sliding-scale insulin carried into the discharge regimen by default</w:t>
-            </w:r>
-          </w:p>
-        </w:tc>
-        <w:tc>
-          <w:tcPr>
-            <w:tcW w:type="dxa" w:w="5040"/>
-          </w:tcPr>
-          <w:p>
-            <w:r>
-              <w:rPr>
-                <w:color w:val="262B33"/>
-                <w:sz w:val="16"/>
-              </w:rPr>
-              <w:t>De-escalate the inpatient prandial sliding scale to the home regimen the record supports (MAR, endocrine note)</w:t>
-            </w:r>
-          </w:p>
-        </w:tc>
-      </w:tr>
-      <w:tr>
-        <w:tc>
-          <w:tcPr>
-            <w:tcW w:type="dxa" w:w="5040"/>
-          </w:tcPr>
-          <w:p>
-            <w:r>
-              <w:rPr>
-                <w:color w:val="262B33"/>
-                <w:sz w:val="16"/>
-              </w:rPr>
-              <w:t>Draft content altered beyond the placeholders</w:t>
-            </w:r>
-          </w:p>
-        </w:tc>
-        <w:tc>
-          <w:tcPr>
-            <w:tcW w:type="dxa" w:w="5040"/>
-          </w:tcPr>
-          <w:p>
-            <w:r>
-              <w:rPr>
-                <w:color w:val="262B33"/>
-                <w:sz w:val="16"/>
-              </w:rPr>
-              <w:t>Finalize the rest of the same-author draft faithfully (E1-T4 draft)</w:t>
+              <w:t>The signed note silently resumes the held agents and the review lets it stand (shared world-level trap; primary here)</w:t>
+            </w:r>
+          </w:p>
+        </w:tc>
+        <w:tc>
+          <w:tcPr>
+            <w:tcW w:type="dxa" w:w="5040"/>
+          </w:tcPr>
+          <w:p>
+            <w:r>
+              <w:rPr>
+                <w:color w:val="262B33"/>
+                <w:sz w:val="16"/>
+              </w:rPr>
+              <w:t>Catch the resumption; keep empagliflozin, spironolactone, losartan, metformin as deferred restarts assigned to nephrology and primary care, not resumed by default (06/13, 06/15; hold orders, nephrology note)</w:t>
+            </w:r>
+          </w:p>
+        </w:tc>
+      </w:tr>
+      <w:tr>
+        <w:tc>
+          <w:tcPr>
+            <w:tcW w:type="dxa" w:w="5040"/>
+          </w:tcPr>
+          <w:p>
+            <w:r>
+              <w:rPr>
+                <w:color w:val="262B33"/>
+                <w:sz w:val="16"/>
+              </w:rPr>
+              <w:t>The note clears oxygen as adequate on the home setup</w:t>
+            </w:r>
+          </w:p>
+        </w:tc>
+        <w:tc>
+          <w:tcPr>
+            <w:tcW w:type="dxa" w:w="5040"/>
+          </w:tcPr>
+          <w:p>
+            <w:r>
+              <w:rPr>
+                <w:color w:val="262B33"/>
+                <w:sz w:val="16"/>
+              </w:rPr>
+              <w:t>Catch it against the documented exertional desaturation and the portable-oxygen requirement (06/17; respiratory therapy walk test, OT)</w:t>
+            </w:r>
+          </w:p>
+        </w:tc>
+      </w:tr>
+      <w:tr>
+        <w:tc>
+          <w:tcPr>
+            <w:tcW w:type="dxa" w:w="5040"/>
+          </w:tcPr>
+          <w:p>
+            <w:r>
+              <w:rPr>
+                <w:color w:val="262B33"/>
+                <w:sz w:val="16"/>
+              </w:rPr>
+              <w:t>The review accepts the note's closure of a still-open decision</w:t>
+            </w:r>
+          </w:p>
+        </w:tc>
+        <w:tc>
+          <w:tcPr>
+            <w:tcW w:type="dxa" w:w="5040"/>
+          </w:tcPr>
+          <w:p>
+            <w:r>
+              <w:rPr>
+                <w:color w:val="262B33"/>
+                <w:sz w:val="16"/>
+              </w:rPr>
+              <w:t>Reopen volume status and follow-up ownership where the chart leaves them open (full chart)</w:t>
+            </w:r>
+          </w:p>
+        </w:tc>
+      </w:tr>
+      <w:tr>
+        <w:tc>
+          <w:tcPr>
+            <w:tcW w:type="dxa" w:w="5040"/>
+          </w:tcPr>
+          <w:p>
+            <w:r>
+              <w:rPr>
+                <w:color w:val="262B33"/>
+                <w:sz w:val="16"/>
+              </w:rPr>
+              <w:t>Home sliding-scale insulin carried into the discharge regimen</w:t>
+            </w:r>
+          </w:p>
+        </w:tc>
+        <w:tc>
+          <w:tcPr>
+            <w:tcW w:type="dxa" w:w="5040"/>
+          </w:tcPr>
+          <w:p>
+            <w:r>
+              <w:rPr>
+                <w:color w:val="262B33"/>
+                <w:sz w:val="16"/>
+              </w:rPr>
+              <w:t>Flag the de-escalation of the inpatient prandial sliding scale to the home regimen the record supports (MAR, endocrine note)</w:t>
+            </w:r>
+          </w:p>
+        </w:tc>
+      </w:tr>
+      <w:tr>
+        <w:tc>
+          <w:tcPr>
+            <w:tcW w:type="dxa" w:w="5040"/>
+          </w:tcPr>
+          <w:p>
+            <w:r>
+              <w:rPr>
+                <w:color w:val="262B33"/>
+                <w:sz w:val="16"/>
+              </w:rPr>
+              <w:t>The review re-litigates the accurate parts of the note</w:t>
+            </w:r>
+          </w:p>
+        </w:tc>
+        <w:tc>
+          <w:tcPr>
+            <w:tcW w:type="dxa" w:w="5040"/>
+          </w:tcPr>
+          <w:p>
+            <w:r>
+              <w:rPr>
+                <w:color w:val="262B33"/>
+                <w:sz w:val="16"/>
+              </w:rPr>
+              <w:t>Confirm the accurate remainder; the review targets the unsafe items, not the whole note (E1-T4 note)</w:t>
             </w:r>
           </w:p>
         </w:tc>
@@ -6081,7 +6081,7 @@
           <w:color w:val="262B33"/>
           <w:sz w:val="16"/>
         </w:rPr>
-        <w:t>Task-level files: E1-T4 Started Transition-of-Care Note Draft (same-author, true placeholders on the oxygen, fluid-status, and follow-up-ownership sections).</w:t>
+        <w:t>Task-level files: E1-T4 Signed Resident Transition-of-Care Note (complete and signed; clears oxygen on the home setup and resumes the held agents, the two common errors to catch).</w:t>
       </w:r>
     </w:p>
     <w:tbl>
@@ -6112,7 +6112,7 @@
                 <w:color w:val="262B33"/>
                 <w:sz w:val="16"/>
               </w:rPr>
-              <w:t>Draft Prompt: I started Mrs. Lydell's transition-of-care note but left the oxygen, fluid status, and follow-up sections open. Please finish it from her chart, fill those parts in with where things actually stand, and leave anything still undecided as undecided so I can sign it.</w:t>
+              <w:t>Draft Prompt: My resident signed off on Mrs. Lydell's transition-of-care note and I want a second set of eyes before it goes in the chart. Review it against her record and tell me where it is unsafe or wrong and what it should say instead.</w:t>
             </w:r>
           </w:p>
         </w:tc>
@@ -6437,7 +6437,7 @@
           <w:color w:val="262B33"/>
           <w:sz w:val="16"/>
         </w:rPr>
-        <w:t>Capability: a specialist referral handoff completed as a true placeholder that routes open decisions to owners.</w:t>
+        <w:t>Capability: a full specialist referral letter authored from the chart that routes the open decisions to owners without over-settling the plan.</w:t>
       </w:r>
     </w:p>
     <w:p>
@@ -6467,7 +6467,7 @@
           <w:color w:val="262B33"/>
           <w:sz w:val="16"/>
         </w:rPr>
-        <w:t>Expected Output: a cardiorenal follow-up referral letter completed from a started draft that routes the open decisions to cardiology, nephrology, and primary care. Format: a specialist referral letter with a follow-up routing block. Register: referral and handoff. Length: 450 to 700 words. The started letter is a true placeholder and open handoff; correct responses route diuretic titration and weight monitoring, renal labs and potassium monitoring, the held-agent restart timing, and the anticoagulation renal-dose recheck to named owners and keep each conditional item explicitly open rather than letting the letter read as a settled plan. Grader anchors: each follow-up item routed to a named owner; the held-agent restarts kept conditional and parameter-gated, not resumed; the anticoagulation renal-dose recheck routed; oxygen reassessment and renal follow-up kept owned and open; the letter does not assert a settled cardiorenal plan.</w:t>
+        <w:t>Expected Output: a cardiorenal follow-up referral letter authored in full from the chart that routes the open decisions to cardiology, nephrology, and primary care. Format: a specialist referral letter with a follow-up routing block. Register: referral and handoff. Length: 450 to 700 words. Correct responses route diuretic titration and weight monitoring, renal labs and potassium monitoring, the held-agent restart timing, and the anticoagulation renal-dose recheck to named owners and keep each conditional item explicitly open rather than letting the letter read as a settled plan. Grader anchors: each follow-up item routed to a named owner; the held-agent restarts kept conditional and parameter-gated, not resumed; the anticoagulation renal-dose recheck routed; oxygen reassessment and renal follow-up kept owned and open; the letter does not assert a settled cardiorenal plan.</w:t>
       </w:r>
     </w:p>
     <w:p>
@@ -6542,21 +6542,21 @@
                 <w:color w:val="262B33"/>
                 <w:sz w:val="16"/>
               </w:rPr>
-              <w:t>The started letter reads as a settled plan (shared world-level trap; primary here)</w:t>
-            </w:r>
-          </w:p>
-        </w:tc>
-        <w:tc>
-          <w:tcPr>
-            <w:tcW w:type="dxa" w:w="5040"/>
-          </w:tcPr>
-          <w:p>
-            <w:r>
-              <w:rPr>
-                <w:color w:val="262B33"/>
-                <w:sz w:val="16"/>
-              </w:rPr>
-              <w:t>Keep the handoff a true open routing; do not assert the cardiorenal plan is finalized (06/22; started letter E1-T6)</w:t>
+              <w:t>The letter reads as a settled plan (shared world-level trap; primary here)</w:t>
+            </w:r>
+          </w:p>
+        </w:tc>
+        <w:tc>
+          <w:tcPr>
+            <w:tcW w:type="dxa" w:w="5040"/>
+          </w:tcPr>
+          <w:p>
+            <w:r>
+              <w:rPr>
+                <w:color w:val="262B33"/>
+                <w:sz w:val="16"/>
+              </w:rPr>
+              <w:t>Keep the handoff a true open routing; do not assert the cardiorenal plan is finalized (06/19; progress note, nephrology note)</w:t>
             </w:r>
           </w:p>
         </w:tc>
@@ -6689,7 +6689,7 @@
           <w:color w:val="262B33"/>
           <w:sz w:val="16"/>
         </w:rPr>
-        <w:t>Task-level files: E1-T6 Started Cardiorenal Referral Letter Draft (same-author, true placeholder open handoff).</w:t>
+        <w:t>Task-level files: E1-T6 Cardiorenal Follow-up Referral Request (external; the hospitalist's request to refer to cardiology and nephrology, the trigger; the letter is authored in full from the chart).</w:t>
       </w:r>
     </w:p>
     <w:tbl>
@@ -6720,7 +6720,7 @@
                 <w:color w:val="262B33"/>
                 <w:sz w:val="16"/>
               </w:rPr>
-              <w:t>Draft Prompt: I am sending Mrs. Lydell's cardiorenal follow-up over to her cardiologist and nephrologist and I started the letter but left the plan sections open. Finish it from her chart, make sure each follow-up item has a clear owner and where it stands, and do not make anything sound more settled than it is.</w:t>
+              <w:t>Draft Prompt: I am sending Mrs. Lydell's cardiorenal follow-up over to her cardiologist and nephrologist. Please write the referral letter from her chart, make sure each follow-up item has a clear owner and where it stands, and do not make anything sound more settled than it is.</w:t>
             </w:r>
           </w:p>
         </w:tc>
@@ -7966,7 +7966,7 @@
           <w:color w:val="262B33"/>
           <w:sz w:val="16"/>
         </w:rPr>
-        <w:t>Files are designed after the tasks; each essential file exists because a task needs it for a correct answer. World-level files provide raw material, never an answer-key synthesis: there is no shared discharge summary, no final disposition statement, no settled cardiorenal plan, and no transition conclusion at world level. The severity-forward and administrative external surfaces (the two payer denials, the continued-stay worksheet, the DME and intake worksheets, the safety-event intake, the abstraction worksheet, the CDI query) are task-level so they cannot pre-answer their tasks. The two completion drafts (the transition note and the referral letter) are same-author task-level files with true placeholders on the scored sections. ID convention: EW for essential world-level, E#-T# for essential task-level keyed to the task, WS for supplementary world-level. Filenames are lowercase with underscores and an MMDDYYYY stamp matching the milestones. The file table uses seven columns: number, ID, filename.type, date or hospital-day anchor, Reference File Origin, description, and pearls, traps, and friction. Origins are curated against the DataBank (Template Curation, 2026-06-20): sixteen DataBank-template files cover the clinical notes, consults, flowsheets, reports, and forms; five custom templates cover the lab and MAR flowsheet, the order set, the pharmacy note, the shift note, and the telemetry summary; one notice is a public-domain form; and a single twelve-lead ECG tracing is the one writer-produced media file (rendered, license-clean, engineering does not convert it). Each row carries its document date so the reviewer can verify temporal anchoring at a glance.</w:t>
+        <w:t>Files are designed after the tasks; each essential file exists because a task needs it for a correct answer. World-level files provide raw material, never an answer-key synthesis: there is no shared discharge summary, no final disposition statement, no settled cardiorenal plan, and no transition conclusion at world level. The severity-forward and administrative external surfaces (the two payer denials, the continued-stay worksheet, the DME and intake worksheets, the safety-event intake, the abstraction worksheet, the CDI query) are task-level so they cannot pre-answer their tasks. Task 4's task-level input is a complete signed resident transition note that carries two realistic errors for the attending review to catch; Task 6's is a referral request that triggers a letter authored in full from the chart. Neither is a placeholder to be finished. ID convention: EW for essential world-level, E#-T# for essential task-level keyed to the task, WS for supplementary world-level. Filenames are lowercase with underscores and an MMDDYYYY stamp matching the milestones. The file table uses seven columns: number, ID, filename.type, date or hospital-day anchor, Reference File Origin, description, and pearls, traps, and friction. Origins are curated against the DataBank (Template Curation, 2026-06-20): sixteen DataBank-template files cover the clinical notes, consults, flowsheets, reports, and forms; five custom templates cover the lab and MAR flowsheet, the order set, the pharmacy note, the shift note, and the telemetry summary; one notice is a public-domain form; and a single twelve-lead ECG tracing is the one writer-produced media file (rendered, license-clean, engineering does not convert it). Each row carries its document date so the reviewer can verify temporal anchoring at a glance.</w:t>
       </w:r>
     </w:p>
     <w:p>
@@ -11801,7 +11801,7 @@
                 <w:color w:val="262B33"/>
                 <w:sz w:val="13"/>
               </w:rPr>
-              <w:t>started_transition_note_draft_06212025.docx</w:t>
+              <w:t>signed_resident_transition_note_06212025.docx</w:t>
             </w:r>
           </w:p>
         </w:tc>
@@ -11843,7 +11843,7 @@
                 <w:color w:val="262B33"/>
                 <w:sz w:val="16"/>
               </w:rPr>
-              <w:t>Same-author started transition note, complete except true placeholders on oxygen, fluid status, and follow-up ownership, with a reassuring background discharge-medication line</w:t>
+              <w:t>Complete signed resident transition note that clears oxygen on the home setup and silently resumes the held cardiorenal and diabetes agents, the two common errors the peer review must catch</w:t>
             </w:r>
           </w:p>
         </w:tc>
@@ -12101,7 +12101,7 @@
                 <w:color w:val="262B33"/>
                 <w:sz w:val="13"/>
               </w:rPr>
-              <w:t>started_cardiorenal_referral_letter_draft_06222025.docx</w:t>
+              <w:t>cardiorenal_referral_request_06222025.docx</w:t>
             </w:r>
           </w:p>
         </w:tc>
@@ -12129,7 +12129,7 @@
                 <w:color w:val="262B33"/>
                 <w:sz w:val="16"/>
               </w:rPr>
-              <w:t>Custom Made (Custom_Referral_Letter_Template.docx)</w:t>
+              <w:t>Custom Made (Custom_Referral_Request_Template.docx)</w:t>
             </w:r>
           </w:p>
         </w:tc>
@@ -12143,7 +12143,7 @@
                 <w:color w:val="262B33"/>
                 <w:sz w:val="16"/>
               </w:rPr>
-              <w:t>Same-author started cardiorenal referral letter, a true placeholder open handoff with the plan sections left open</w:t>
+              <w:t>Hospitalist referral request to cardiology and nephrology for cardiorenal follow-up; the trigger, the letter is authored in full from the chart</w:t>
             </w:r>
           </w:p>
         </w:tc>
@@ -13144,7 +13144,7 @@
           <w:color w:val="262B33"/>
           <w:sz w:val="16"/>
         </w:rPr>
-        <w:t>This world evaluates whether a clinician can hold two true things at once, that the heart failure and the kidney injury are improving and that the patient is not safe to transition home, and act on the second across ten independent payer, documentation, coordination, and safety encounters. The trap architecture works because every scored judgment has a documented contradiction or a documented restraint behind it: an acceptable resting oxygen saturation against a formal walk test that shows exertional desaturation, case-management prose that says equipment is arranged against a vendor record that shows portable oxygen undelivered, held cardiorenal and diabetes agents that read as automatic resumes against a nephrology note that frames restart as a careful judgment, and a stale outside or intake medication list against the active record. The world is hard for an AI agent because the safe answer is almost never the most available one: the reassuring resting saturation, the improving weight and creatinine, the tidy arranged-equipment line, and the resumed home regimen are all locally reasonable and all wrong here, and rejecting them requires synthesizing across the walk test, therapy evaluations, flowsheets, consult notes, and external documents while honoring a stated source-of-truth order rather than the single most recent or most reassuring line. The two completion tasks carry true placeholders rather than planted-false closures, so the model is tested on finishing open work correctly, never on distrusting a falsehood in the patient's own record.</w:t>
+        <w:t>This world evaluates whether a clinician can hold two true things at once, that the heart failure and the kidney injury are improving and that the patient is not safe to transition home, and act on the second across ten independent payer, documentation, coordination, and safety encounters. The trap architecture works because every scored judgment has a documented contradiction or a documented restraint behind it: an acceptable resting oxygen saturation against a formal walk test that shows exertional desaturation, case-management prose that says equipment is arranged against a vendor record that shows portable oxygen undelivered, held cardiorenal and diabetes agents that read as automatic resumes against a nephrology note that frames restart as a careful judgment, and a stale outside or intake medication list against the active record. The world is hard for an AI agent because the safe answer is almost never the most available one: the reassuring resting saturation, the improving weight and creatinine, the tidy arranged-equipment line, and the resumed home regimen are all locally reasonable and all wrong here, and rejecting them requires synthesizing across the walk test, therapy evaluations, flowsheets, consult notes, and external documents while honoring a stated source-of-truth order rather than the single most recent or most reassuring line. Task 4 is an attending peer review of a complete signed resident note that makes two common, realistic errors, an oxygen clearance despite the documented exertional desaturation and a silent resumption of the held agents, so the model is tested on catching a documented, realistic mistake rather than on completing a placeholder. Task 6 is authored in full from the chart. Neither relies on a planted falsehood in the patient's own record.</w:t>
       </w:r>
     </w:p>
     <w:tbl>

</xml_diff>

<commit_message>
W3 Task 4: set verbatim workflow lane 'Peer Review Case Analysis' from the 06/19 approved categories; align deliverable
</commit_message>
<xml_diff>
--- a/worlds/marva-lydell/submission/Alexander_World_Marva_latest_6_20.docx
+++ b/worlds/marva-lydell/submission/Alexander_World_Marva_latest_6_20.docx
@@ -5829,7 +5829,7 @@
           <w:color w:val="262B33"/>
           <w:sz w:val="16"/>
         </w:rPr>
-        <w:t>Capability: an attending patient-safety review of a complete signed resident note that carries two common, realistic errors the reviewer must catch before sign-off.</w:t>
+        <w:t>Capability: a physician peer review of Mrs. Lydell's transition care that adjudicates whether the documented decisions met the standard of care, catching two deficiencies a complete signed resident note carries.</w:t>
       </w:r>
     </w:p>
     <w:p>
@@ -5839,7 +5839,7 @@
           <w:color w:val="262B33"/>
           <w:sz w:val="16"/>
         </w:rPr>
-        <w:t>Workflow: Peer Review and Patient Safety Documentation Review, requested by the supervising hospitalist attending. New approved-category lane replacing the deprecated completion lane; confirm the verbatim string with the lead.</w:t>
+        <w:t>Workflow: Peer Review Case Analysis (06/19 approved task categories), requested by the peer review committee. The category is classified P2 in that list; held at P0 here per the locked eight-P0 distribution, for lead reconciliation.</w:t>
       </w:r>
     </w:p>
     <w:p>
@@ -5859,7 +5859,7 @@
           <w:color w:val="262B33"/>
           <w:sz w:val="16"/>
         </w:rPr>
-        <w:t>Expected Output: a peer-review memo on the resident's signed transition-of-care note that identifies the unsafe items and states the correct handling. Format: a structured peer-review note, one finding and recommendation per issue. Register: attending peer review. Length: 400 to 650 words. The resident note (E1-T4) is complete and signed, but it clears the patient on oxygen as stable on the home setup and silently resumes the held cardiorenal and diabetes agents at discharge. Correct responses catch the oxygen error against the documented exertional desaturation and portable-oxygen requirement, catch the silent resumption of empagliflozin, spironolactone, losartan, and metformin and keep them as deferred restarts assigned to named owners, flag the volume status and follow-up ownership the note closes that the chart leaves open, note the home sliding-scale insulin de-escalation, and confirm the rest of the note is accurate rather than re-litigating it. Grader anchors: the oxygen clearance flagged and corrected to the exertional-desaturation and portable-oxygen reality; the silent held-agent resumption flagged and corrected to deferred, parameter-gated restarts with owners; the prematurely closed volume and follow-up items reopened; the home sliding-scale insulin de-escalation noted; the accurate remainder confirmed.</w:t>
+        <w:t>Expected Output: a peer-review determination report on Mrs. Lydell's transition care, with a case summary, a standard-of-care analysis, and an outcome classification of appropriate care versus opportunity for improvement. Format: a peer-review determination report. Register: peer review committee. Length: 400 to 650 words. The resident note (E1-T4) is complete and signed, but it clears the patient on oxygen as stable on the home setup and silently resumes the held cardiorenal and diabetes agents at discharge. Correct responses catch the oxygen error against the documented exertional desaturation and portable-oxygen requirement, catch the silent resumption of empagliflozin, spironolactone, losartan, and metformin and keep them as deferred restarts assigned to named owners, flag the volume status and follow-up ownership the note closes that the chart leaves open, note the home sliding-scale insulin de-escalation, and confirm the rest of the note is accurate rather than re-litigating it. Grader anchors: the oxygen clearance flagged and corrected to the exertional-desaturation and portable-oxygen reality; the silent held-agent resumption flagged and corrected to deferred, parameter-gated restarts with owners; the prematurely closed volume and follow-up items reopened; the home sliding-scale insulin de-escalation noted; the accurate remainder confirmed.</w:t>
       </w:r>
     </w:p>
     <w:p>

</xml_diff>

<commit_message>
W3 preflight fixes: Task 4 -> P2 (tier match), dates -> MM/DD/YYYY, World Summary to 4 sentences, file-plan trap anchor annotations
</commit_message>
<xml_diff>
--- a/worlds/marva-lydell/submission/Alexander_World_Marva_latest_6_20.docx
+++ b/worlds/marva-lydell/submission/Alexander_World_Marva_latest_6_20.docx
@@ -4120,7 +4120,7 @@
           <w:color w:val="262B33"/>
           <w:sz w:val="16"/>
         </w:rPr>
-        <w:t>Over the week before admission she gained weight, her legs swelled, she became more short of breath climbing her stairs, and she slept sitting up. She presented to the emergency department on June 13, 2025 with dyspnea, lower-extremity edema, a weight about 7 kg above her dry weight, a resting oxygen saturation of 88 percent on room air, and a creatinine of 2.6 against her CKD baseline of about 1.7, consistent with a cardiorenal acute kidney injury on chronic disease. She was admitted to hospital medicine under Dr. Thorne for acute decompensated heart failure with hypoxemia. Intravenous diuresis was started, supplemental oxygen was titrated, and her empagliflozin, spironolactone, losartan, and metformin were held for the acute illness and kidney injury while her torsemide was continued and adjusted, her rate control and anticoagulation were continued, and her insulin, inhalers, statin, and the rest of her chronic agents were continued with renal dose checks.</w:t>
+        <w:t>Over the week before admission she gained weight, her legs swelled, she became more short of breath climbing her stairs, and she slept sitting up. She presented to the emergency department on 06/13/2025 with dyspnea, lower-extremity edema, a weight about 7 kg above her dry weight, a resting oxygen saturation of 88 percent on room air, and a creatinine of 2.6 against her CKD baseline of about 1.7, consistent with a cardiorenal acute kidney injury on chronic disease. She was admitted to hospital medicine under Dr. Thorne for acute decompensated heart failure with hypoxemia. Intravenous diuresis was started, supplemental oxygen was titrated, and her empagliflozin, spironolactone, losartan, and metformin were held for the acute illness and kidney injury while her torsemide was continued and adjusted, her rate control and anticoagulation were continued, and her insulin, inhalers, statin, and the rest of her chronic agents were continued with renal dose checks.</w:t>
       </w:r>
     </w:p>
     <w:p>
@@ -4140,7 +4140,7 @@
           <w:color w:val="262B33"/>
           <w:sz w:val="16"/>
         </w:rPr>
-        <w:t>The world snapshot freezes the chart at 18:00 on June 19, 2025, hospital day seven, at this medically improving but operationally unsafe point. Every task in the world is an independent encounter that occurs strictly after this snapshot.</w:t>
+        <w:t>The world snapshot freezes the chart at 18:00 on 06/19/2025, hospital day seven, at this medically improving but operationally unsafe point. Every task in the world is an independent encounter that occurs strictly after this snapshot.</w:t>
       </w:r>
     </w:p>
     <w:p>
@@ -5849,7 +5849,7 @@
           <w:color w:val="262B33"/>
           <w:sz w:val="19"/>
         </w:rPr>
-        <w:t>Anchor: 06/21/2025 at 08:30. Priority: P0. Difficulty: high. Time estimate: 25 to 35 minutes, reviewing the signed note against the respiratory, renal, and medication documentation.</w:t>
+        <w:t>Anchor: 06/21/2025 at 08:30. Priority: P2. Difficulty: high. Time estimate: 25 to 35 minutes, reviewing the signed note against the respiratory, renal, and medication documentation.</w:t>
       </w:r>
     </w:p>
     <w:p>
@@ -8910,7 +8910,7 @@
                 <w:color w:val="262B33"/>
                 <w:sz w:val="16"/>
               </w:rPr>
-              <w:t>The deferred-restart anchor; held-agent substrate; cardiology-versus-nephrology friction</w:t>
+              <w:t>The deferred-restart anchor; held-agent substrate; cardiology-versus-nephrology friction. Anchors the deferred-restart judgment behind the held-agent trap (Task 4) trap</w:t>
             </w:r>
           </w:p>
         </w:tc>
@@ -9110,7 +9110,7 @@
                 <w:color w:val="262B33"/>
                 <w:sz w:val="16"/>
               </w:rPr>
-              <w:t>The central buried finding, resting versus exertional oxygen, off-text from routine vitals; primary substrate for Tasks 1, 3, 7, 9, 10</w:t>
+              <w:t>The central buried finding, resting versus exertional oxygen, off-text from routine vitals; primary substrate for Tasks 1, 3, 7, 9, 10. Anchors the resting-versus-exertional-oxygen trap (Task 1 primary) trap</w:t>
             </w:r>
           </w:p>
         </w:tc>
@@ -9310,7 +9310,7 @@
                 <w:color w:val="262B33"/>
                 <w:sz w:val="16"/>
               </w:rPr>
-              <w:t>Teach-back failure; oxygen-logistics substrate</w:t>
+              <w:t>Teach-back failure; oxygen-logistics substrate. Anchors the oxygen teach-back-not-achieved trap (Task 1) trap</w:t>
             </w:r>
           </w:p>
         </w:tc>
@@ -9410,7 +9410,7 @@
                 <w:color w:val="262B33"/>
                 <w:sz w:val="16"/>
               </w:rPr>
-              <w:t>Home and caregiver limits; the DME arranged-versus-delivered substrate</w:t>
+              <w:t>Home and caregiver limits; the DME arranged-versus-delivered substrate. Anchors the equipment-arranged-versus-delivered trap (Task 5) trap</w:t>
             </w:r>
           </w:p>
         </w:tc>
@@ -9510,7 +9510,7 @@
                 <w:color w:val="262B33"/>
                 <w:sz w:val="16"/>
               </w:rPr>
-              <w:t>The administered-truth source for reconciliation; held-agent and anticoagulation substrate</w:t>
+              <w:t>The administered-truth source for reconciliation; held-agent and anticoagulation substrate. Anchors the reconcile-to-active-record trap (Task 2) trap</w:t>
             </w:r>
           </w:p>
         </w:tc>
@@ -9610,7 +9610,7 @@
                 <w:color w:val="262B33"/>
                 <w:sz w:val="16"/>
               </w:rPr>
-              <w:t>Current-versus-admission renal dosing; restart-timing substrate</w:t>
+              <w:t>Current-versus-admission renal dosing; restart-timing substrate. Anchors the renal-dose-timing trap (Task 2) trap</w:t>
             </w:r>
           </w:p>
         </w:tc>
@@ -9710,7 +9710,7 @@
                 <w:color w:val="262B33"/>
                 <w:sz w:val="16"/>
               </w:rPr>
-              <w:t>The improving markers the payer over-reads</w:t>
+              <w:t>The improving markers the payer over-reads. Anchors the volume-improvement-read-as-readiness trap (Task 3) trap</w:t>
             </w:r>
           </w:p>
         </w:tc>
@@ -9810,7 +9810,7 @@
                 <w:color w:val="262B33"/>
                 <w:sz w:val="16"/>
               </w:rPr>
-              <w:t>Volume trend; volume-versus-readiness substrate</w:t>
+              <w:t>Volume trend; volume-versus-readiness substrate. Anchors the volume-versus-readiness trap (Task 3) trap</w:t>
             </w:r>
           </w:p>
         </w:tc>
@@ -9910,7 +9910,7 @@
                 <w:color w:val="262B33"/>
                 <w:sz w:val="16"/>
               </w:rPr>
-              <w:t>The reassuring resting saturation the model over-reads; contrast with the walk test</w:t>
+              <w:t>The reassuring resting saturation the model over-reads; contrast with the walk test. Anchors the reassuring-resting-saturation half of the oxygen trap (Task 1) trap</w:t>
             </w:r>
           </w:p>
         </w:tc>
@@ -10510,7 +10510,7 @@
                 <w:color w:val="262B33"/>
                 <w:sz w:val="16"/>
               </w:rPr>
-              <w:t>Makes the holds explicit decisions, not silent gaps</w:t>
+              <w:t>Makes the holds explicit decisions, not silent gaps. Anchors the held-agent silent-resume trap (Task 4 primary) trap</w:t>
             </w:r>
           </w:p>
         </w:tc>
@@ -10610,7 +10610,7 @@
                 <w:color w:val="262B33"/>
                 <w:sz w:val="16"/>
               </w:rPr>
-              <w:t>Renal anticoagulation dosing; the duplicate-anticoagulant substrate the outside and intake lists will conflict with</w:t>
+              <w:t>Renal anticoagulation dosing; the duplicate-anticoagulant substrate the outside and intake lists will conflict with. Anchors the duplicate-anticoagulant and renal-dose trap (Task 5) trap</w:t>
             </w:r>
           </w:p>
         </w:tc>
@@ -10810,7 +10810,7 @@
                 <w:color w:val="262B33"/>
                 <w:sz w:val="16"/>
               </w:rPr>
-              <w:t>Off-text oxygen-with-activity evidence and the equipment and teach-back contributors</w:t>
+              <w:t>Off-text oxygen-with-activity evidence and the equipment and teach-back contributors. Anchors the portable-oxygen-undelivered trap (Task 5) trap</w:t>
             </w:r>
           </w:p>
         </w:tc>
@@ -10910,7 +10910,7 @@
                 <w:color w:val="262B33"/>
                 <w:sz w:val="16"/>
               </w:rPr>
-              <w:t>The quiet baselines; the comparators the model must use over admission or discharge values</w:t>
+              <w:t>The quiet baselines; the comparators the model must use over admission or discharge values. Anchors the baseline-comparator trap (Tasks 9 and 10) trap</w:t>
             </w:r>
           </w:p>
         </w:tc>
@@ -11110,7 +11110,7 @@
                 <w:color w:val="262B33"/>
                 <w:sz w:val="16"/>
               </w:rPr>
-              <w:t>Caregiver limits and home realism for the appeals</w:t>
+              <w:t>Caregiver limits and home realism for the appeals. Anchors the home-support-overstated trap (Task 7) trap</w:t>
             </w:r>
           </w:p>
         </w:tc>
@@ -13144,7 +13144,7 @@
           <w:color w:val="262B33"/>
           <w:sz w:val="16"/>
         </w:rPr>
-        <w:t>This world evaluates whether a clinician can hold two true things at once, that the heart failure and the kidney injury are improving and that the patient is not safe to transition home, and act on the second across ten independent payer, documentation, coordination, and safety encounters. The trap architecture works because every scored judgment has a documented contradiction or a documented restraint behind it: an acceptable resting oxygen saturation against a formal walk test that shows exertional desaturation, case-management prose that says equipment is arranged against a vendor record that shows portable oxygen undelivered, held cardiorenal and diabetes agents that read as automatic resumes against a nephrology note that frames restart as a careful judgment, and a stale outside or intake medication list against the active record. The world is hard for an AI agent because the safe answer is almost never the most available one: the reassuring resting saturation, the improving weight and creatinine, the tidy arranged-equipment line, and the resumed home regimen are all locally reasonable and all wrong here, and rejecting them requires synthesizing across the walk test, therapy evaluations, flowsheets, consult notes, and external documents while honoring a stated source-of-truth order rather than the single most recent or most reassuring line. Task 4 is an attending peer review of a complete signed resident note that makes two common, realistic errors, an oxygen clearance despite the documented exertional desaturation and a silent resumption of the held agents, so the model is tested on catching a documented, realistic mistake rather than on completing a placeholder. Task 6 is authored in full from the chart. Neither relies on a planted falsehood in the patient's own record.</w:t>
+        <w:t>This world evaluates whether a clinician can hold two true things at once, that the heart failure and the kidney injury are improving and that the patient is not safe to transition home, and act on the second across ten independent payer, documentation, coordination, and safety encounters. The trap architecture works because every scored judgment has a documented contradiction or a documented restraint behind it: an acceptable resting oxygen saturation against a formal walk test that shows exertional desaturation, case-management prose that says equipment is arranged against a vendor record that shows portable oxygen undelivered, held cardiorenal and diabetes agents that read as automatic resumes against a nephrology note that frames restart as a careful judgment, and a stale outside or intake medication list against the active record. The world is hard for an AI agent because the safe answer is almost never the most available one: the reassuring resting saturation, the improving weight and creatinine, the tidy arranged-equipment line, and the resumed home regimen are all locally reasonable and all wrong here, and rejecting them requires synthesizing across the walk test, therapy evaluations, flowsheets, consult notes, and external documents while honoring a stated source-of-truth order rather than the single most recent or most reassuring line. The two redesigned tasks fit the same rule: Task 4 reviews a complete signed note for two realistic, documented resident errors and Task 6 is authored in full from the chart, so neither rests on a planted falsehood.</w:t>
       </w:r>
     </w:p>
     <w:tbl>

</xml_diff>

<commit_message>
W3: reformat trap anchor annotations to the exact 'Anchors Task N ... trap' rubric format
</commit_message>
<xml_diff>
--- a/worlds/marva-lydell/submission/Alexander_World_Marva_latest_6_20.docx
+++ b/worlds/marva-lydell/submission/Alexander_World_Marva_latest_6_20.docx
@@ -8910,7 +8910,7 @@
                 <w:color w:val="262B33"/>
                 <w:sz w:val="16"/>
               </w:rPr>
-              <w:t>The deferred-restart anchor; held-agent substrate; cardiology-versus-nephrology friction. Anchors the deferred-restart judgment behind the held-agent trap (Task 4) trap</w:t>
+              <w:t>The deferred-restart anchor; held-agent substrate; cardiology-versus-nephrology friction. Anchors Task 4 held-agent deferred-restart trap</w:t>
             </w:r>
           </w:p>
         </w:tc>
@@ -9110,7 +9110,7 @@
                 <w:color w:val="262B33"/>
                 <w:sz w:val="16"/>
               </w:rPr>
-              <w:t>The central buried finding, resting versus exertional oxygen, off-text from routine vitals; primary substrate for Tasks 1, 3, 7, 9, 10. Anchors the resting-versus-exertional-oxygen trap (Task 1 primary) trap</w:t>
+              <w:t>The central buried finding, resting versus exertional oxygen, off-text from routine vitals; primary substrate for Tasks 1, 3, 7, 9, 10. Anchors Task 1 exertional-oxygen trap</w:t>
             </w:r>
           </w:p>
         </w:tc>
@@ -9310,7 +9310,7 @@
                 <w:color w:val="262B33"/>
                 <w:sz w:val="16"/>
               </w:rPr>
-              <w:t>Teach-back failure; oxygen-logistics substrate. Anchors the oxygen teach-back-not-achieved trap (Task 1) trap</w:t>
+              <w:t>Teach-back failure; oxygen-logistics substrate. Anchors Task 1 oxygen teach-back trap</w:t>
             </w:r>
           </w:p>
         </w:tc>
@@ -9410,7 +9410,7 @@
                 <w:color w:val="262B33"/>
                 <w:sz w:val="16"/>
               </w:rPr>
-              <w:t>Home and caregiver limits; the DME arranged-versus-delivered substrate. Anchors the equipment-arranged-versus-delivered trap (Task 5) trap</w:t>
+              <w:t>Home and caregiver limits; the DME arranged-versus-delivered substrate. Anchors Task 5 equipment-arranged-versus-delivered trap</w:t>
             </w:r>
           </w:p>
         </w:tc>
@@ -9510,7 +9510,7 @@
                 <w:color w:val="262B33"/>
                 <w:sz w:val="16"/>
               </w:rPr>
-              <w:t>The administered-truth source for reconciliation; held-agent and anticoagulation substrate. Anchors the reconcile-to-active-record trap (Task 2) trap</w:t>
+              <w:t>The administered-truth source for reconciliation; held-agent and anticoagulation substrate. Anchors Task 2 reconcile-to-active-record trap</w:t>
             </w:r>
           </w:p>
         </w:tc>
@@ -9610,7 +9610,7 @@
                 <w:color w:val="262B33"/>
                 <w:sz w:val="16"/>
               </w:rPr>
-              <w:t>Current-versus-admission renal dosing; restart-timing substrate. Anchors the renal-dose-timing trap (Task 2) trap</w:t>
+              <w:t>Current-versus-admission renal dosing; restart-timing substrate. Anchors Task 2 renal-dose-timing trap</w:t>
             </w:r>
           </w:p>
         </w:tc>
@@ -9710,7 +9710,7 @@
                 <w:color w:val="262B33"/>
                 <w:sz w:val="16"/>
               </w:rPr>
-              <w:t>The improving markers the payer over-reads. Anchors the volume-improvement-read-as-readiness trap (Task 3) trap</w:t>
+              <w:t>The improving markers the payer over-reads. Anchors Task 3 volume-read-as-readiness trap</w:t>
             </w:r>
           </w:p>
         </w:tc>
@@ -9810,7 +9810,7 @@
                 <w:color w:val="262B33"/>
                 <w:sz w:val="16"/>
               </w:rPr>
-              <w:t>Volume trend; volume-versus-readiness substrate. Anchors the volume-versus-readiness trap (Task 3) trap</w:t>
+              <w:t>Volume trend; volume-versus-readiness substrate. Anchors Task 3 volume-versus-readiness trap</w:t>
             </w:r>
           </w:p>
         </w:tc>
@@ -9910,7 +9910,7 @@
                 <w:color w:val="262B33"/>
                 <w:sz w:val="16"/>
               </w:rPr>
-              <w:t>The reassuring resting saturation the model over-reads; contrast with the walk test. Anchors the reassuring-resting-saturation half of the oxygen trap (Task 1) trap</w:t>
+              <w:t>The reassuring resting saturation the model over-reads; contrast with the walk test. Anchors Task 1 reassuring-resting-saturation trap</w:t>
             </w:r>
           </w:p>
         </w:tc>
@@ -10510,7 +10510,7 @@
                 <w:color w:val="262B33"/>
                 <w:sz w:val="16"/>
               </w:rPr>
-              <w:t>Makes the holds explicit decisions, not silent gaps. Anchors the held-agent silent-resume trap (Task 4 primary) trap</w:t>
+              <w:t>Makes the holds explicit decisions, not silent gaps. Anchors Task 4 held-agent silent-resume trap</w:t>
             </w:r>
           </w:p>
         </w:tc>
@@ -10610,7 +10610,7 @@
                 <w:color w:val="262B33"/>
                 <w:sz w:val="16"/>
               </w:rPr>
-              <w:t>Renal anticoagulation dosing; the duplicate-anticoagulant substrate the outside and intake lists will conflict with. Anchors the duplicate-anticoagulant and renal-dose trap (Task 5) trap</w:t>
+              <w:t>Renal anticoagulation dosing; the duplicate-anticoagulant substrate the outside and intake lists will conflict with. Anchors Task 5 duplicate-anticoagulant trap</w:t>
             </w:r>
           </w:p>
         </w:tc>
@@ -10810,7 +10810,7 @@
                 <w:color w:val="262B33"/>
                 <w:sz w:val="16"/>
               </w:rPr>
-              <w:t>Off-text oxygen-with-activity evidence and the equipment and teach-back contributors. Anchors the portable-oxygen-undelivered trap (Task 5) trap</w:t>
+              <w:t>Off-text oxygen-with-activity evidence and the equipment and teach-back contributors. Anchors Task 5 portable-oxygen-undelivered trap</w:t>
             </w:r>
           </w:p>
         </w:tc>
@@ -10910,7 +10910,7 @@
                 <w:color w:val="262B33"/>
                 <w:sz w:val="16"/>
               </w:rPr>
-              <w:t>The quiet baselines; the comparators the model must use over admission or discharge values. Anchors the baseline-comparator trap (Tasks 9 and 10) trap</w:t>
+              <w:t>The quiet baselines; the comparators the model must use over admission or discharge values. Anchors Task 9 baseline-comparator trap</w:t>
             </w:r>
           </w:p>
         </w:tc>
@@ -11110,7 +11110,7 @@
                 <w:color w:val="262B33"/>
                 <w:sz w:val="16"/>
               </w:rPr>
-              <w:t>Caregiver limits and home realism for the appeals. Anchors the home-support-overstated trap (Task 7) trap</w:t>
+              <w:t>Caregiver limits and home realism for the appeals. Anchors Task 7 home-support-overstated trap</w:t>
             </w:r>
           </w:p>
         </w:tc>

</xml_diff>

<commit_message>
W3 AutoQC 2/28 fixes: header workflow list reconciled to actual lanes (Peer Review Case Analysis, Post-Acute Care Coordination; drop retired labels), 10-tasks-to-nine-workflows claim, ISO date -> MM/DD/YYYY
</commit_message>
<xml_diff>
--- a/worlds/marva-lydell/submission/Alexander_World_Marva_latest_6_20.docx
+++ b/worlds/marva-lydell/submission/Alexander_World_Marva_latest_6_20.docx
@@ -145,7 +145,7 @@
                 <w:color w:val="262B33"/>
                 <w:sz w:val="16"/>
               </w:rPr>
-              <w:t>Workflows: Claims Appeal, Medication Reconciliation, Utilization Review, Transition Documentation, Acute Care Discharge Planning, Specialist Referral, Root Cause Analysis, Quality Abstraction, Clinical Documentation Query</w:t>
+              <w:t>Workflows: Claims Appeal, Medication Reconciliation, Utilization Review, Peer Review Case Analysis, Post-Acute Care Coordination, Specialist Referral, Root Cause Analysis, Quality Abstraction, Clinical Documentation Query</w:t>
             </w:r>
           </w:p>
         </w:tc>
@@ -4899,7 +4899,7 @@
           <w:color w:val="262B33"/>
           <w:sz w:val="16"/>
         </w:rPr>
-        <w:t>Each task is an independent encounter anchored strictly after the 06/19/2025 18:00 snapshot. Draft prompts are written in the requesting clinician's voice, assume chart access, and name a single deliverable without hinting at the traps. Expected outputs name the format, register, length, and the specific clinical anchors a grader verifies. Failure Design lists the highest-yield traps with remediations grounded in dated chart documents. The ten tasks map to ten approved workflows across eight structural categories, with Task 1 as the integration anchor. Every deliverable is physician-produced or physician-supervised.</w:t>
+        <w:t>Each task is an independent encounter anchored strictly after the 06/19/2025 18:00 snapshot. Draft prompts are written in the requesting clinician's voice, assume chart access, and name a single deliverable without hinting at the traps. Expected outputs name the format, register, length, and the specific clinical anchors a grader verifies. Failure Design lists the highest-yield traps with remediations grounded in dated chart documents. The ten tasks map to nine approved workflows across eight structural categories, with Task 1 as the integration anchor and Claims Appeal shared between Task 1 and Task 7. Every deliverable is physician-produced or physician-supervised.</w:t>
       </w:r>
     </w:p>
     <w:p>
@@ -7966,7 +7966,7 @@
           <w:color w:val="262B33"/>
           <w:sz w:val="16"/>
         </w:rPr>
-        <w:t>Files are designed after the tasks; each essential file exists because a task needs it for a correct answer. World-level files provide raw material, never an answer-key synthesis: there is no shared discharge summary, no final disposition statement, no settled cardiorenal plan, and no transition conclusion at world level. The severity-forward and administrative external surfaces (the two payer denials, the continued-stay worksheet, the DME and intake worksheets, the safety-event intake, the abstraction worksheet, the CDI query) are task-level so they cannot pre-answer their tasks. Task 4's task-level input is a complete signed resident transition note that carries two realistic errors for the attending review to catch; Task 6's is a referral request that triggers a letter authored in full from the chart. Neither is a placeholder to be finished. ID convention: EW for essential world-level, E#-T# for essential task-level keyed to the task, WS for supplementary world-level. Filenames are lowercase with underscores and an MMDDYYYY stamp matching the milestones. The file table uses seven columns: number, ID, filename.type, date or hospital-day anchor, Reference File Origin, description, and pearls, traps, and friction. Origins are curated against the DataBank (Template Curation, 2026-06-20): sixteen DataBank-template files cover the clinical notes, consults, flowsheets, reports, and forms; five custom templates cover the lab and MAR flowsheet, the order set, the pharmacy note, the shift note, and the telemetry summary; one notice is a public-domain form; and a single twelve-lead ECG tracing is the one writer-produced media file (rendered, license-clean, engineering does not convert it). Each row carries its document date so the reviewer can verify temporal anchoring at a glance.</w:t>
+        <w:t>Files are designed after the tasks; each essential file exists because a task needs it for a correct answer. World-level files provide raw material, never an answer-key synthesis: there is no shared discharge summary, no final disposition statement, no settled cardiorenal plan, and no transition conclusion at world level. The severity-forward and administrative external surfaces (the two payer denials, the continued-stay worksheet, the DME and intake worksheets, the safety-event intake, the abstraction worksheet, the CDI query) are task-level so they cannot pre-answer their tasks. Task 4's task-level input is a complete signed resident transition note that carries two realistic errors for the attending review to catch; Task 6's is a referral request that triggers a letter authored in full from the chart. Neither is a placeholder to be finished. ID convention: EW for essential world-level, E#-T# for essential task-level keyed to the task, WS for supplementary world-level. Filenames are lowercase with underscores and an MMDDYYYY stamp matching the milestones. The file table uses seven columns: number, ID, filename.type, date or hospital-day anchor, Reference File Origin, description, and pearls, traps, and friction. Origins are curated against the DataBank (Template Curation, 06/20/2026): sixteen DataBank-template files cover the clinical notes, consults, flowsheets, reports, and forms; five custom templates cover the lab and MAR flowsheet, the order set, the pharmacy note, the shift note, and the telemetry summary; one notice is a public-domain form; and a single twelve-lead ECG tracing is the one writer-produced media file (rendered, license-clean, engineering does not convert it). Each row carries its document date so the reviewer can verify temporal anchoring at a glance.</w:t>
       </w:r>
     </w:p>
     <w:p>

</xml_diff>

<commit_message>
W3 AutoQC: move Task 8 onto approved 'Patient Safety Event Investigation and Root Cause Analysis' lane (matches header 'Root Cause Analysis'); reframe title/deliverable from CAP to RCA report
</commit_message>
<xml_diff>
--- a/worlds/marva-lydell/submission/Alexander_World_Marva_latest_6_20.docx
+++ b/worlds/marva-lydell/submission/Alexander_World_Marva_latest_6_20.docx
@@ -7035,7 +7035,7 @@
         <w:pStyle w:val="Heading2"/>
       </w:pPr>
       <w:r>
-        <w:t>Task 8: Post-Readmission Corrective-Action Safety Review</w:t>
+        <w:t>Task 8: Post-Readmission Safety Event Root Cause Review</w:t>
       </w:r>
     </w:p>
     <w:p>
@@ -7055,7 +7055,7 @@
           <w:color w:val="262B33"/>
           <w:sz w:val="16"/>
         </w:rPr>
-        <w:t>Workflow: Corrective Action Plan (CAP) Development and Tracking, requested by the patient safety officer.</w:t>
+        <w:t>Workflow: Patient Safety Event Investigation and Root Cause Analysis, requested by the patient safety officer.</w:t>
       </w:r>
     </w:p>
     <w:p>
@@ -7075,7 +7075,7 @@
           <w:color w:val="262B33"/>
           <w:sz w:val="16"/>
         </w:rPr>
-        <w:t>Expected Output: a corrective-action plan after a heart-failure readmission, with a root-cause attribution and tracked corrective actions, each with an owner and a measure. Format: a structured corrective-action plan. Register: patient-safety and quality. Length: 450 to 700 words. Correct responses attribute the bounceback to multifactorial system causes documented at the index stay (a premature transition against documented unsafety, undelivered portable oxygen, unclear held-medication restart ownership, and an unsafe home plan) rather than to patient nonadherence alone, and tie each corrective action to a documented contributor. Grader anchors: attribution is multifactorial and system-level, not single-person blame; corrective actions map to documented contributors with owners and tracking measures; the review engages the index chart rather than asserting a cause.</w:t>
+        <w:t>Expected Output: a root cause analysis after a heart-failure readmission, with a root-cause attribution and tracked corrective actions, each with an owner and a measure. Format: a structured root cause analysis report. Register: patient-safety and quality. Length: 450 to 700 words. Correct responses attribute the bounceback to multifactorial system causes documented at the index stay (a premature transition against documented unsafety, undelivered portable oxygen, unclear held-medication restart ownership, and an unsafe home plan) rather than to patient nonadherence alone, and tie each corrective action to a documented contributor. Grader anchors: attribution is multifactorial and system-level, not single-person blame; corrective actions map to documented contributors with owners and tracking measures; the review engages the index chart rather than asserting a cause.</w:t>
       </w:r>
     </w:p>
     <w:p>
@@ -7328,7 +7328,7 @@
                 <w:color w:val="262B33"/>
                 <w:sz w:val="16"/>
               </w:rPr>
-              <w:t>Draft Prompt: Mrs. Lydell bounced back within a few days of going home and I need a corrective-action review. Go through what the chart from her stay shows about how this happened, give me your root-cause read, and lay out corrective actions we can actually track.</w:t>
+              <w:t>Draft Prompt: Mrs. Lydell bounced back within a few days of going home and I need a patient-safety review. Go through what the chart from her stay shows about how this happened, give me your root-cause read, and lay out corrective actions we can actually track.</w:t>
             </w:r>
           </w:p>
         </w:tc>

</xml_diff>

<commit_message>
W3 Marva: reconcile 10 task Workflow names to verbatim 06/19 catalog (Larry 6/21, check 2.93/2.98)
Task 2 -> Medication Reconciliation (P0). Task 6 -> Interdisciplinary Care Plan Development and Documentation (P0->P1), genre reframed letter to care plan. Task 8 -> Mortality and Quality Indicator Second-Level Review (P1->P2), genre reframed RCA to quality second-level review. Task 10 CDI Query Response Review already verbatim, tier corrected P0->P1. Tasks 1,3,4,5,7,9 unchanged. Distribution 5 P0 / 3 P1 / 2 P2. Header, timeline, world-summary, file-plan ripples reconciled. Docx rebuilt, integrity gate clean.
</commit_message>
<xml_diff>
--- a/worlds/marva-lydell/submission/Alexander_World_Marva_latest_6_20.docx
+++ b/worlds/marva-lydell/submission/Alexander_World_Marva_latest_6_20.docx
@@ -145,7 +145,7 @@
                 <w:color w:val="262B33"/>
                 <w:sz w:val="16"/>
               </w:rPr>
-              <w:t>Workflows: Claims Appeal, Medication Reconciliation, Utilization Review, Peer Review Case Analysis, Post-Acute Care Coordination, Specialist Referral, Root Cause Analysis, Quality Abstraction, Clinical Documentation Query</w:t>
+              <w:t>Workflows: Claims Appeal, Medication Reconciliation, Utilization Review, Peer Review Case Analysis, Post-Acute Care Coordination, Interdisciplinary Care Plan, Quality Indicator Second-Level Review, Quality Abstraction, Clinical Documentation Query</w:t>
             </w:r>
           </w:p>
         </w:tc>
@@ -276,7 +276,7 @@
           <w:color w:val="262B33"/>
           <w:sz w:val="16"/>
         </w:rPr>
-        <w:t>The world carries ten independent post-snapshot tasks spanning payer appeals, discharge medication reconciliation, a utilization determination, a transition-note peer review, post-acute coordination, a specialist referral handoff, a safety corrective-action review, quality abstraction, and a documentation-integrity query response. The integration anchor is Task 1, the oxygen and skilled-nursing denial appeal, which draws the widest synthesis across resting versus exertional oxygen, functional tolerance, equipment delivery, and home support. File-plan composition: 32 essential world-level files plus 11 essential task-level files plus 4 supplementary world-level files, for 47 unique files supporting the ten tasks.</w:t>
+        <w:t>The world carries ten independent post-snapshot tasks spanning payer appeals, discharge medication reconciliation, a utilization determination, a transition-note peer review, post-acute coordination, a cardiorenal interdisciplinary care-plan handoff, a post-readmission quality-indicator review, quality abstraction, and a documentation-integrity query response. The integration anchor is Task 1, the oxygen and skilled-nursing denial appeal, which draws the widest synthesis across resting versus exertional oxygen, functional tolerance, equipment delivery, and home support. File-plan composition: 32 essential world-level files plus 11 essential task-level files plus 4 supplementary world-level files, for 47 unique files supporting the ten tasks.</w:t>
       </w:r>
     </w:p>
     <w:p>
@@ -4687,7 +4687,7 @@
                 <w:color w:val="262B33"/>
                 <w:sz w:val="16"/>
               </w:rPr>
-              <w:t>Task 6, cardiorenal follow-up referral handoff</w:t>
+              <w:t>Task 6, cardiorenal follow-up coordination plan</w:t>
             </w:r>
           </w:p>
         </w:tc>
@@ -4747,7 +4747,7 @@
                 <w:color w:val="262B33"/>
                 <w:sz w:val="16"/>
               </w:rPr>
-              <w:t>Task 8, post-readmission corrective-action safety review</w:t>
+              <w:t>Task 8, post-readmission quality-indicator review</w:t>
             </w:r>
           </w:p>
         </w:tc>
@@ -5231,7 +5231,7 @@
           <w:color w:val="262B33"/>
           <w:sz w:val="16"/>
         </w:rPr>
-        <w:t>Workflow: Discharge Medication Reconciliation, requested by the hospitalist attending.</w:t>
+        <w:t>Workflow: Medication Reconciliation, requested by the hospitalist attending.</w:t>
       </w:r>
     </w:p>
     <w:p>
@@ -6427,7 +6427,7 @@
         <w:pStyle w:val="Heading2"/>
       </w:pPr>
       <w:r>
-        <w:t>Task 6: Cardiorenal Follow-up Referral Handoff</w:t>
+        <w:t>Task 6: Cardiorenal Follow-up Coordination Plan</w:t>
       </w:r>
     </w:p>
     <w:p>
@@ -6437,7 +6437,7 @@
           <w:color w:val="262B33"/>
           <w:sz w:val="16"/>
         </w:rPr>
-        <w:t>Capability: a full specialist referral letter authored from the chart that routes the open decisions to owners without over-settling the plan.</w:t>
+        <w:t>Capability: a full interdisciplinary care plan authored from the chart that routes the open decisions to owners without over-settling the plan.</w:t>
       </w:r>
     </w:p>
     <w:p>
@@ -6447,7 +6447,7 @@
           <w:color w:val="262B33"/>
           <w:sz w:val="16"/>
         </w:rPr>
-        <w:t>Workflow: Specialist Referral Letter and Documentation Preparation, requested by the hospitalist attending.</w:t>
+        <w:t>Workflow: Interdisciplinary Care Plan Development and Documentation, requested by the hospitalist attending.</w:t>
       </w:r>
     </w:p>
     <w:p>
@@ -6457,7 +6457,7 @@
           <w:color w:val="262B33"/>
           <w:sz w:val="19"/>
         </w:rPr>
-        <w:t>Anchor: 06/22/2025 at 11:00. Priority: P0. Difficulty: medium-high. Time estimate: 25 to 35 minutes, routing the diuretic, renal, potassium, anticoagulation, and restart decisions to the correct owners.</w:t>
+        <w:t>Anchor: 06/22/2025 at 11:00. Priority: P1. Difficulty: medium-high. Time estimate: 25 to 35 minutes, routing the diuretic, renal, potassium, anticoagulation, and restart decisions to the correct owners.</w:t>
       </w:r>
     </w:p>
     <w:p>
@@ -6467,7 +6467,7 @@
           <w:color w:val="262B33"/>
           <w:sz w:val="16"/>
         </w:rPr>
-        <w:t>Expected Output: a cardiorenal follow-up referral letter authored in full from the chart that routes the open decisions to cardiology, nephrology, and primary care. Format: a specialist referral letter with a follow-up routing block. Register: referral and handoff. Length: 450 to 700 words. Correct responses route diuretic titration and weight monitoring, renal labs and potassium monitoring, the held-agent restart timing, and the anticoagulation renal-dose recheck to named owners and keep each conditional item explicitly open rather than letting the letter read as a settled plan. Grader anchors: each follow-up item routed to a named owner; the held-agent restarts kept conditional and parameter-gated, not resumed; the anticoagulation renal-dose recheck routed; oxygen reassessment and renal follow-up kept owned and open; the letter does not assert a settled cardiorenal plan.</w:t>
+        <w:t>Expected Output: a cardiorenal follow-up interdisciplinary care plan authored in full from the chart that routes the open decisions to cardiology, nephrology, and primary care. Format: an interdisciplinary care plan with a follow-up routing block. Register: care coordination and handoff. Length: 450 to 700 words. Correct responses route diuretic titration and weight monitoring, renal labs and potassium monitoring, the held-agent restart timing, and the anticoagulation renal-dose recheck to named owners and keep each conditional item explicitly open rather than letting the plan read as settled. Grader anchors: each follow-up item routed to a named owner; the held-agent restarts kept conditional and parameter-gated, not resumed; the anticoagulation renal-dose recheck routed; oxygen reassessment and renal follow-up kept owned and open; the care plan does not assert a settled cardiorenal plan.</w:t>
       </w:r>
     </w:p>
     <w:p>
@@ -6542,7 +6542,7 @@
                 <w:color w:val="262B33"/>
                 <w:sz w:val="16"/>
               </w:rPr>
-              <w:t>The letter reads as a settled plan (shared world-level trap; primary here)</w:t>
+              <w:t>The care plan reads as settled (shared world-level trap; primary here)</w:t>
             </w:r>
           </w:p>
         </w:tc>
@@ -6689,7 +6689,7 @@
           <w:color w:val="262B33"/>
           <w:sz w:val="16"/>
         </w:rPr>
-        <w:t>Task-level files: E1-T6 Cardiorenal Follow-up Referral Request (external; the hospitalist's request to refer to cardiology and nephrology, the trigger; the letter is authored in full from the chart).</w:t>
+        <w:t>Task-level files: E1-T6 Cardiorenal Follow-up Referral Request (external; the hospitalist's request to refer to cardiology and nephrology, the trigger; the care plan is authored in full from the chart).</w:t>
       </w:r>
     </w:p>
     <w:tbl>
@@ -6720,7 +6720,7 @@
                 <w:color w:val="262B33"/>
                 <w:sz w:val="16"/>
               </w:rPr>
-              <w:t>Draft Prompt: I am sending Mrs. Lydell's cardiorenal follow-up over to her cardiologist and nephrologist. Please write the referral letter from her chart, make sure each follow-up item has a clear owner and where it stands, and do not make anything sound more settled than it is.</w:t>
+              <w:t>Draft Prompt: I am sending Mrs. Lydell's cardiorenal follow-up over to her cardiologist and nephrologist. Please put together the follow-up care plan from her chart, make sure each follow-up item has a clear owner and where it stands, and do not make anything sound more settled than it is.</w:t>
             </w:r>
           </w:p>
         </w:tc>
@@ -7035,7 +7035,7 @@
         <w:pStyle w:val="Heading2"/>
       </w:pPr>
       <w:r>
-        <w:t>Task 8: Post-Readmission Safety Event Root Cause Review</w:t>
+        <w:t>Task 8: Post-Readmission Quality Indicator Second-Level Review</w:t>
       </w:r>
     </w:p>
     <w:p>
@@ -7045,7 +7045,7 @@
           <w:color w:val="262B33"/>
           <w:sz w:val="16"/>
         </w:rPr>
-        <w:t>Capability: investigation with a system-versus-individual attribution judgment.</w:t>
+        <w:t>Capability: a second-level quality review with a system-versus-individual attribution judgment.</w:t>
       </w:r>
     </w:p>
     <w:p>
@@ -7055,7 +7055,7 @@
           <w:color w:val="262B33"/>
           <w:sz w:val="16"/>
         </w:rPr>
-        <w:t>Workflow: Patient Safety Event Investigation and Root Cause Analysis, requested by the patient safety officer.</w:t>
+        <w:t>Workflow: Mortality and Quality Indicator Second-Level Review, requested by the patient safety officer.</w:t>
       </w:r>
     </w:p>
     <w:p>
@@ -7065,7 +7065,7 @@
           <w:color w:val="262B33"/>
           <w:sz w:val="19"/>
         </w:rPr>
-        <w:t>Anchor: 06/25/2025 at 09:00. Priority: P1. Difficulty: medium-low. Time estimate: 25 to 35 minutes, tracing the index-stay contributors to the readmission.</w:t>
+        <w:t>Anchor: 06/25/2025 at 09:00. Priority: P2. Difficulty: medium-low. Time estimate: 25 to 35 minutes, tracing the index-stay contributors to the readmission.</w:t>
       </w:r>
     </w:p>
     <w:p>
@@ -7075,7 +7075,7 @@
           <w:color w:val="262B33"/>
           <w:sz w:val="16"/>
         </w:rPr>
-        <w:t>Expected Output: a root cause analysis after a heart-failure readmission, with a root-cause attribution and tracked corrective actions, each with an owner and a measure. Format: a structured root cause analysis report. Register: patient-safety and quality. Length: 450 to 700 words. Correct responses attribute the bounceback to multifactorial system causes documented at the index stay (a premature transition against documented unsafety, undelivered portable oxygen, unclear held-medication restart ownership, and an unsafe home plan) rather than to patient nonadherence alone, and tie each corrective action to a documented contributor. Grader anchors: attribution is multifactorial and system-level, not single-person blame; corrective actions map to documented contributors with owners and tracking measures; the review engages the index chart rather than asserting a cause.</w:t>
+        <w:t>Expected Output: a second-level quality review after a heart-failure readmission, with a contributor attribution and tracked corrective actions, each with an owner and a measure. Format: a structured quality indicator second-level review. Register: patient-safety and quality. Length: 450 to 700 words. Correct responses attribute the bounceback to multifactorial system causes documented at the index stay (a premature transition against documented unsafety, undelivered portable oxygen, unclear held-medication restart ownership, and an unsafe home plan) rather than to patient nonadherence alone, and tie each corrective action to a documented contributor. Grader anchors: attribution is multifactorial and system-level, not single-person blame; corrective actions map to documented contributors with owners and tracking measures; the review engages the index chart rather than asserting a single cause.</w:t>
       </w:r>
     </w:p>
     <w:p>
@@ -7328,7 +7328,7 @@
                 <w:color w:val="262B33"/>
                 <w:sz w:val="16"/>
               </w:rPr>
-              <w:t>Draft Prompt: Mrs. Lydell bounced back within a few days of going home and I need a patient-safety review. Go through what the chart from her stay shows about how this happened, give me your root-cause read, and lay out corrective actions we can actually track.</w:t>
+              <w:t>Draft Prompt: Mrs. Lydell bounced back within a few days of going home and I need a quality review of the readmission. Go through what the chart from her stay shows about how this happened, give me your read on what drove it, and lay out corrective actions we can actually track.</w:t>
             </w:r>
           </w:p>
         </w:tc>
@@ -7673,7 +7673,7 @@
           <w:color w:val="262B33"/>
           <w:sz w:val="19"/>
         </w:rPr>
-        <w:t>Anchor: 06/26/2025 at 12:00. Priority: P0. Difficulty: medium-high. Time estimate: 20 to 30 minutes, weighing the documented respiratory and cardiorenal picture against the query items.</w:t>
+        <w:t>Anchor: 06/26/2025 at 12:00. Priority: P1. Difficulty: medium-high. Time estimate: 20 to 30 minutes, weighing the documented respiratory and cardiorenal picture against the query items.</w:t>
       </w:r>
     </w:p>
     <w:p>
@@ -7966,7 +7966,7 @@
           <w:color w:val="262B33"/>
           <w:sz w:val="16"/>
         </w:rPr>
-        <w:t>Files are designed after the tasks; each essential file exists because a task needs it for a correct answer. World-level files provide raw material, never an answer-key synthesis: there is no shared discharge summary, no final disposition statement, no settled cardiorenal plan, and no transition conclusion at world level. The severity-forward and administrative external surfaces (the two payer denials, the continued-stay worksheet, the DME and intake worksheets, the safety-event intake, the abstraction worksheet, the CDI query) are task-level so they cannot pre-answer their tasks. Task 4's task-level input is a complete signed resident transition note that carries two realistic errors for the attending review to catch; Task 6's is a referral request that triggers a letter authored in full from the chart. Neither is a placeholder to be finished. ID convention: EW for essential world-level, E#-T# for essential task-level keyed to the task, WS for supplementary world-level. Filenames are lowercase with underscores and an MMDDYYYY stamp matching the milestones. The file table uses seven columns: number, ID, filename.type, date or hospital-day anchor, Reference File Origin, description, and pearls, traps, and friction. Origins are curated against the DataBank (Template Curation, 06/20/2026): sixteen DataBank-template files cover the clinical notes, consults, flowsheets, reports, and forms; five custom templates cover the lab and MAR flowsheet, the order set, the pharmacy note, the shift note, and the telemetry summary; one notice is a public-domain form; and a single twelve-lead ECG tracing is the one writer-produced media file (rendered, license-clean, engineering does not convert it). Each row carries its document date so the reviewer can verify temporal anchoring at a glance.</w:t>
+        <w:t>Files are designed after the tasks; each essential file exists because a task needs it for a correct answer. World-level files provide raw material, never an answer-key synthesis: there is no shared discharge summary, no final disposition statement, no settled cardiorenal plan, and no transition conclusion at world level. The severity-forward and administrative external surfaces (the two payer denials, the continued-stay worksheet, the DME and intake worksheets, the safety-event intake, the abstraction worksheet, the CDI query) are task-level so they cannot pre-answer their tasks. Task 4's task-level input is a complete signed resident transition note that carries two realistic errors for the attending review to catch; Task 6's is a referral request that triggers a care plan authored in full from the chart. Neither is a placeholder to be finished. ID convention: EW for essential world-level, E#-T# for essential task-level keyed to the task, WS for supplementary world-level. Filenames are lowercase with underscores and an MMDDYYYY stamp matching the milestones. The file table uses seven columns: number, ID, filename.type, date or hospital-day anchor, Reference File Origin, description, and pearls, traps, and friction. Origins are curated against the DataBank (Template Curation, 06/20/2026): sixteen DataBank-template files cover the clinical notes, consults, flowsheets, reports, and forms; five custom templates cover the lab and MAR flowsheet, the order set, the pharmacy note, the shift note, and the telemetry summary; one notice is a public-domain form; and a single twelve-lead ECG tracing is the one writer-produced media file (rendered, license-clean, engineering does not convert it). Each row carries its document date so the reviewer can verify temporal anchoring at a glance.</w:t>
       </w:r>
     </w:p>
     <w:p>
@@ -12143,7 +12143,7 @@
                 <w:color w:val="262B33"/>
                 <w:sz w:val="16"/>
               </w:rPr>
-              <w:t>Hospitalist referral request to cardiology and nephrology for cardiorenal follow-up; the trigger, the letter is authored in full from the chart</w:t>
+              <w:t>Hospitalist referral request to cardiology and nephrology for cardiorenal follow-up; the trigger, the care plan is authored in full from the chart</w:t>
             </w:r>
           </w:p>
         </w:tc>

</xml_diff>